<commit_message>
update  code. Add dataset_loader.ipynb,evaluate_ft_model.ipynb,rag.ipynb
</commit_message>
<xml_diff>
--- a/writings/Exploring Text-to-Images Generators for Medical Cases Answer Engine.docx
+++ b/writings/Exploring Text-to-Images Generators for Medical Cases Answer Engine.docx
@@ -1680,23 +1680,7 @@
           <w:rFonts w:hint="eastAsia"/>
           <w:lang w:eastAsia="zh-CN"/>
         </w:rPr>
-        <w:t xml:space="preserve"> The model M2I2 [3] utilized masking techniques and contrastive learning to learn the image-text representations. </w:t>
-      </w:r>
-      <w:proofErr w:type="spellStart"/>
-      <w:r>
-        <w:rPr>
-          <w:rFonts w:hint="eastAsia"/>
-          <w:lang w:eastAsia="zh-CN"/>
-        </w:rPr>
-        <w:t>LLaVA</w:t>
-      </w:r>
-      <w:proofErr w:type="spellEnd"/>
-      <w:r>
-        <w:rPr>
-          <w:rFonts w:hint="eastAsia"/>
-          <w:lang w:eastAsia="zh-CN"/>
-        </w:rPr>
-        <w:t xml:space="preserve">-Med [4] </w:t>
+        <w:t xml:space="preserve"> The model M2I2 [3] utilized masking techniques and contrastive learning to learn the image-text representations. LLaVA-Med [4] </w:t>
       </w:r>
       <w:r>
         <w:rPr>
@@ -1710,39 +1694,7 @@
           <w:rFonts w:hint="eastAsia"/>
           <w:lang w:eastAsia="zh-CN"/>
         </w:rPr>
-        <w:t xml:space="preserve"> [10] introduced a multimodal prompt retrieval module in their work to boost the quality of the generated answers. [8] presented the Modular Collaborative Chain-of-Thought (MC-</w:t>
-      </w:r>
-      <w:proofErr w:type="spellStart"/>
-      <w:r>
-        <w:rPr>
-          <w:rFonts w:hint="eastAsia"/>
-          <w:lang w:eastAsia="zh-CN"/>
-        </w:rPr>
-        <w:t>CoT</w:t>
-      </w:r>
-      <w:proofErr w:type="spellEnd"/>
-      <w:r>
-        <w:rPr>
-          <w:rFonts w:hint="eastAsia"/>
-          <w:lang w:eastAsia="zh-CN"/>
-        </w:rPr>
-        <w:t xml:space="preserve">) for zero-shot medical VQA tasks, and the reasoning ability empowered by the </w:t>
-      </w:r>
-      <w:proofErr w:type="spellStart"/>
-      <w:r>
-        <w:rPr>
-          <w:rFonts w:hint="eastAsia"/>
-          <w:lang w:eastAsia="zh-CN"/>
-        </w:rPr>
-        <w:t>CoT</w:t>
-      </w:r>
-      <w:proofErr w:type="spellEnd"/>
-      <w:r>
-        <w:rPr>
-          <w:rFonts w:hint="eastAsia"/>
-          <w:lang w:eastAsia="zh-CN"/>
-        </w:rPr>
-        <w:t xml:space="preserve"> was encouraging. [9] showed a flexible architecture that fused a large language model for radiology and a medical-adapted vision model to enhance medical QVA. [12] created a self-learning pipeline which provided data augmentation by generating open-ended questions and corresponding answers.</w:t>
+        <w:t xml:space="preserve"> [10] introduced a multimodal prompt retrieval module in their work to boost the quality of the generated answers. [8] presented the Modular Collaborative Chain-of-Thought (MC-CoT) for zero-shot medical VQA tasks, and the reasoning ability empowered by the CoT was encouraging. [9] showed a flexible architecture that fused a large language model for radiology and a medical-adapted vision model to enhance medical QVA. [12] created a self-learning pipeline which provided data augmentation by generating open-ended questions and corresponding answers.</w:t>
       </w:r>
       <w:r>
         <w:rPr>
@@ -1756,7 +1708,20 @@
           <w:rFonts w:hint="eastAsia"/>
           <w:lang w:eastAsia="zh-CN"/>
         </w:rPr>
-        <w:t>[5] suggested the VG-CALF network, and it leveraged both the intra- and inter-modal relationships to improve medical VQA system.</w:t>
+        <w:t xml:space="preserve">[5] suggested the VG-CALF network, and it leveraged both the intra- and inter-modal relationships to improve </w:t>
+      </w:r>
+      <w:r>
+        <w:rPr>
+          <w:lang w:eastAsia="zh-CN"/>
+        </w:rPr>
+        <w:t xml:space="preserve">the </w:t>
+      </w:r>
+      <w:r>
+        <w:rPr>
+          <w:rFonts w:hint="eastAsia"/>
+          <w:lang w:eastAsia="zh-CN"/>
+        </w:rPr>
+        <w:t>medical VQA system.</w:t>
       </w:r>
       <w:r>
         <w:rPr>
@@ -1770,46 +1735,14 @@
           <w:rFonts w:hint="eastAsia"/>
           <w:lang w:eastAsia="zh-CN"/>
         </w:rPr>
-        <w:t xml:space="preserve">Recently, [6] proposed </w:t>
-      </w:r>
-      <w:proofErr w:type="spellStart"/>
-      <w:r>
-        <w:rPr>
-          <w:rFonts w:hint="eastAsia"/>
-          <w:lang w:eastAsia="zh-CN"/>
-        </w:rPr>
-        <w:t>UnICLAM</w:t>
-      </w:r>
-      <w:proofErr w:type="spellEnd"/>
-      <w:r>
-        <w:rPr>
-          <w:rFonts w:hint="eastAsia"/>
-          <w:lang w:eastAsia="zh-CN"/>
-        </w:rPr>
-        <w:t>, a unified and interpretable model for cross-modal learning in medical VQA. [7] contributed a multi-scale visual encoder framework and a language feature enhancement module to fulfill the information requirement in medical VQA.</w:t>
-      </w:r>
-      <w:r>
-        <w:rPr>
-          <w:rFonts w:hint="eastAsia"/>
-          <w:lang w:eastAsia="zh-CN"/>
-        </w:rPr>
-        <w:t xml:space="preserve"> MM-</w:t>
-      </w:r>
-      <w:proofErr w:type="spellStart"/>
-      <w:r>
-        <w:rPr>
-          <w:rFonts w:hint="eastAsia"/>
-          <w:lang w:eastAsia="zh-CN"/>
-        </w:rPr>
-        <w:t>Tramba</w:t>
-      </w:r>
-      <w:proofErr w:type="spellEnd"/>
-      <w:r>
-        <w:rPr>
-          <w:rFonts w:hint="eastAsia"/>
-          <w:lang w:eastAsia="zh-CN"/>
-        </w:rPr>
-        <w:t xml:space="preserve"> [13] based on </w:t>
+        <w:t>Recently, [6] proposed UnICLAM, a unified and interpretable model for cross-modal learning in medical VQA. [7] contributed a multi-scale visual encoder framework and a language feature enhancement module to fulfill the information requirement in medical VQA.</w:t>
+      </w:r>
+      <w:r>
+        <w:rPr>
+          <w:rFonts w:hint="eastAsia"/>
+          <w:lang w:eastAsia="zh-CN"/>
+        </w:rPr>
+        <w:t xml:space="preserve"> MM-Tramba [13] based on </w:t>
       </w:r>
       <w:r>
         <w:rPr>
@@ -2006,7 +1939,15 @@
           <w:rFonts w:hint="eastAsia"/>
           <w:lang w:eastAsia="zh-CN"/>
         </w:rPr>
-        <w:t xml:space="preserve">A benchmark tool was proposed by </w:t>
+        <w:t xml:space="preserve">A </w:t>
+      </w:r>
+      <w:r>
+        <w:rPr>
+          <w:rFonts w:hint="eastAsia"/>
+          <w:lang w:eastAsia="zh-CN"/>
+        </w:rPr>
+        <w:lastRenderedPageBreak/>
+        <w:t xml:space="preserve">benchmark tool was proposed by </w:t>
       </w:r>
       <w:r>
         <w:rPr>
@@ -2090,7 +2031,14 @@
           <w:rFonts w:hint="eastAsia"/>
           <w:lang w:eastAsia="zh-CN"/>
         </w:rPr>
-        <w:t xml:space="preserve"> language of life and human natural language, which can help medical QA by improving </w:t>
+        <w:t xml:space="preserve"> language of life and human natural language, </w:t>
+      </w:r>
+      <w:r>
+        <w:rPr>
+          <w:rFonts w:hint="eastAsia"/>
+          <w:lang w:eastAsia="zh-CN"/>
+        </w:rPr>
+        <w:t xml:space="preserve">which can help medical QA by improving </w:t>
       </w:r>
       <w:r>
         <w:rPr>
@@ -2347,27 +2295,14 @@
                         <w:r>
                           <w:t xml:space="preserve">Table </w:t>
                         </w:r>
-                        <w:r>
-                          <w:fldChar w:fldCharType="begin"/>
-                        </w:r>
-                        <w:r>
-                          <w:instrText xml:space="preserve"> SEQ Table \* ARABIC </w:instrText>
-                        </w:r>
-                        <w:r>
-                          <w:fldChar w:fldCharType="separate"/>
-                        </w:r>
-                        <w:r>
-                          <w:rPr>
-                            <w:noProof/>
-                          </w:rPr>
-                          <w:t>1</w:t>
-                        </w:r>
-                        <w:r>
-                          <w:rPr>
-                            <w:noProof/>
-                          </w:rPr>
-                          <w:fldChar w:fldCharType="end"/>
-                        </w:r>
+                        <w:fldSimple w:instr=" SEQ Table \* ARABIC ">
+                          <w:r>
+                            <w:rPr>
+                              <w:noProof/>
+                            </w:rPr>
+                            <w:t>1</w:t>
+                          </w:r>
+                        </w:fldSimple>
                         <w:r>
                           <w:rPr>
                             <w:rFonts w:hint="eastAsia"/>
@@ -2689,39 +2624,7 @@
                                   <w:sz w:val="16"/>
                                   <w:szCs w:val="16"/>
                                 </w:rPr>
-                                <w:t xml:space="preserve">Text encoder from </w:t>
-                              </w:r>
-                              <w:proofErr w:type="spellStart"/>
-                              <w:r>
-                                <w:rPr>
-                                  <w:sz w:val="16"/>
-                                  <w:szCs w:val="16"/>
-                                </w:rPr>
-                                <w:t>PubMedClip</w:t>
-                              </w:r>
-                              <w:proofErr w:type="spellEnd"/>
-                              <w:r>
-                                <w:rPr>
-                                  <w:sz w:val="16"/>
-                                  <w:szCs w:val="16"/>
-                                </w:rPr>
-                                <w:t xml:space="preserve"> is less powerful for </w:t>
-                              </w:r>
-                              <w:proofErr w:type="spellStart"/>
-                              <w:r>
-                                <w:rPr>
-                                  <w:sz w:val="16"/>
-                                  <w:szCs w:val="16"/>
-                                </w:rPr>
-                                <w:t>MedVQA</w:t>
-                              </w:r>
-                              <w:proofErr w:type="spellEnd"/>
-                              <w:r>
-                                <w:rPr>
-                                  <w:sz w:val="16"/>
-                                  <w:szCs w:val="16"/>
-                                </w:rPr>
-                                <w:t>; A lack of explainability.</w:t>
+                                <w:t>Text encoder from PubMedClip is less powerful for MedVQA; A lack of explainability.</w:t>
                               </w:r>
                             </w:p>
                           </w:tc>
@@ -2796,25 +2699,7 @@
                                   <w:sz w:val="16"/>
                                   <w:szCs w:val="16"/>
                                 </w:rPr>
-                                <w:t xml:space="preserve">The </w:t>
-                              </w:r>
-                              <w:proofErr w:type="spellStart"/>
-                              <w:r>
-                                <w:rPr>
-                                  <w:color w:val="000000"/>
-                                  <w:sz w:val="16"/>
-                                  <w:szCs w:val="16"/>
-                                </w:rPr>
-                                <w:t>ImageCLEF</w:t>
-                              </w:r>
-                              <w:proofErr w:type="spellEnd"/>
-                              <w:r>
-                                <w:rPr>
-                                  <w:color w:val="000000"/>
-                                  <w:sz w:val="16"/>
-                                  <w:szCs w:val="16"/>
-                                </w:rPr>
-                                <w:t xml:space="preserve"> caption dataset used for pretraining is relatively small; the quality of the pretrained model might not be ideal. </w:t>
+                                <w:t xml:space="preserve">The ImageCLEF caption dataset used for pretraining is relatively small; the quality of the pretrained model might not be ideal. </w:t>
                               </w:r>
                             </w:p>
                           </w:tc>
@@ -3422,25 +3307,7 @@
                                   <w:sz w:val="16"/>
                                   <w:szCs w:val="16"/>
                                 </w:rPr>
-                                <w:t xml:space="preserve">Increased complexity that introduced by the attention mechanism and the image-question complementary loss. This model is not widely evaluated using datasets other than </w:t>
-                              </w:r>
-                              <w:proofErr w:type="spellStart"/>
-                              <w:r>
-                                <w:rPr>
-                                  <w:color w:val="000000"/>
-                                  <w:sz w:val="16"/>
-                                  <w:szCs w:val="16"/>
-                                </w:rPr>
-                                <w:t>PathVQA</w:t>
-                              </w:r>
-                              <w:proofErr w:type="spellEnd"/>
-                              <w:r>
-                                <w:rPr>
-                                  <w:color w:val="000000"/>
-                                  <w:sz w:val="16"/>
-                                  <w:szCs w:val="16"/>
-                                </w:rPr>
-                                <w:t xml:space="preserve"> and VQA-RAD, so the generality to unseen medical fields is unknown.</w:t>
+                                <w:t>Increased complexity that introduced by the attention mechanism and the image-question complementary loss. This model is not widely evaluated using datasets other than PathVQA and VQA-RAD, so the generality to unseen medical fields is unknown.</w:t>
                               </w:r>
                             </w:p>
                           </w:tc>
@@ -3791,23 +3658,7 @@
           <w:rFonts w:hint="eastAsia"/>
           <w:lang w:eastAsia="zh-CN"/>
         </w:rPr>
-        <w:t xml:space="preserve"> proposed </w:t>
-      </w:r>
-      <w:proofErr w:type="spellStart"/>
-      <w:r>
-        <w:rPr>
-          <w:rFonts w:hint="eastAsia"/>
-          <w:lang w:eastAsia="zh-CN"/>
-        </w:rPr>
-        <w:t>MedCLIP</w:t>
-      </w:r>
-      <w:proofErr w:type="spellEnd"/>
-      <w:r>
-        <w:rPr>
-          <w:rFonts w:hint="eastAsia"/>
-          <w:lang w:eastAsia="zh-CN"/>
-        </w:rPr>
-        <w:t>, a CLIP-style approach in</w:t>
+        <w:t xml:space="preserve"> proposed MedCLIP, a CLIP-style approach in</w:t>
       </w:r>
       <w:r>
         <w:rPr>
@@ -4069,363 +3920,21 @@
           <w:rFonts w:hint="eastAsia"/>
           <w:lang w:eastAsia="zh-CN"/>
         </w:rPr>
-        <w:t xml:space="preserve">diffusion models are widely used for synthesis. </w:t>
-      </w:r>
-      <w:r>
-        <w:rPr>
-          <w:rFonts w:hint="eastAsia"/>
-          <w:lang w:eastAsia="zh-CN"/>
-        </w:rPr>
-        <w:t>[27]</w:t>
-      </w:r>
-      <w:r>
-        <w:rPr>
-          <w:rFonts w:hint="eastAsia"/>
-          <w:lang w:eastAsia="zh-CN"/>
-        </w:rPr>
-        <w:t xml:space="preserve"> proposed </w:t>
-      </w:r>
-      <w:proofErr w:type="spellStart"/>
-      <w:r>
-        <w:rPr>
-          <w:rFonts w:hint="eastAsia"/>
-          <w:lang w:eastAsia="zh-CN"/>
-        </w:rPr>
-        <w:t>MediSyn</w:t>
-      </w:r>
-      <w:proofErr w:type="spellEnd"/>
-      <w:r>
-        <w:rPr>
-          <w:rFonts w:hint="eastAsia"/>
-          <w:lang w:eastAsia="zh-CN"/>
-        </w:rPr>
-        <w:t>, a text-guided LDM-based image synthesizing model for multiple medical fields.</w:t>
-      </w:r>
-      <w:r>
-        <w:rPr>
-          <w:rFonts w:hint="eastAsia"/>
-          <w:lang w:eastAsia="zh-CN"/>
-        </w:rPr>
-        <w:t xml:space="preserve"> [25</w:t>
-      </w:r>
-      <w:r>
-        <w:rPr>
-          <w:rFonts w:hint="eastAsia"/>
-          <w:lang w:eastAsia="zh-CN"/>
-        </w:rPr>
-        <w:t>,26,28</w:t>
-      </w:r>
-      <w:r>
-        <w:rPr>
-          <w:rFonts w:hint="eastAsia"/>
-          <w:lang w:eastAsia="zh-CN"/>
-        </w:rPr>
-        <w:t>]</w:t>
-      </w:r>
-      <w:r>
-        <w:rPr>
-          <w:rFonts w:hint="eastAsia"/>
-          <w:lang w:eastAsia="zh-CN"/>
-        </w:rPr>
-        <w:t xml:space="preserve"> are other diffusion-based model</w:t>
-      </w:r>
-      <w:r>
-        <w:rPr>
-          <w:lang w:eastAsia="zh-CN"/>
-        </w:rPr>
-        <w:t>s</w:t>
-      </w:r>
-      <w:r>
-        <w:rPr>
-          <w:rFonts w:hint="eastAsia"/>
-          <w:lang w:eastAsia="zh-CN"/>
-        </w:rPr>
-        <w:t xml:space="preserve"> in various medical fields. </w:t>
-      </w:r>
-      <w:r>
-        <w:rPr>
-          <w:rFonts w:hint="eastAsia"/>
-          <w:lang w:eastAsia="zh-CN"/>
-        </w:rPr>
-        <w:t xml:space="preserve">The alignment of text and vision input is vital for </w:t>
-      </w:r>
-      <w:r>
-        <w:rPr>
-          <w:lang w:eastAsia="zh-CN"/>
-        </w:rPr>
-        <w:t xml:space="preserve">the </w:t>
-      </w:r>
-      <w:r>
-        <w:rPr>
-          <w:rFonts w:hint="eastAsia"/>
-          <w:lang w:eastAsia="zh-CN"/>
-        </w:rPr>
-        <w:t xml:space="preserve">fidelity of generated images. </w:t>
-      </w:r>
-      <w:r>
-        <w:rPr>
-          <w:rFonts w:hint="eastAsia"/>
-          <w:lang w:eastAsia="zh-CN"/>
-        </w:rPr>
-        <w:t>[29]</w:t>
-      </w:r>
-      <w:r>
-        <w:rPr>
-          <w:rFonts w:hint="eastAsia"/>
-          <w:lang w:eastAsia="zh-CN"/>
-        </w:rPr>
-        <w:t xml:space="preserve"> proposed a vision-language pretraining framework for multimodal alignment in </w:t>
-      </w:r>
-      <w:r>
-        <w:rPr>
-          <w:lang w:eastAsia="zh-CN"/>
-        </w:rPr>
-        <w:t xml:space="preserve">the </w:t>
-      </w:r>
-      <w:r>
-        <w:rPr>
-          <w:rFonts w:hint="eastAsia"/>
-          <w:lang w:eastAsia="zh-CN"/>
-        </w:rPr>
-        <w:t>medical field.</w:t>
-      </w:r>
-      <w:r>
-        <w:rPr>
-          <w:rFonts w:hint="eastAsia"/>
-          <w:lang w:eastAsia="zh-CN"/>
-        </w:rPr>
-        <w:t xml:space="preserve"> Table 3 shows the comparison among tho</w:t>
-      </w:r>
-      <w:r>
-        <w:rPr>
-          <w:rFonts w:hint="eastAsia"/>
-          <w:lang w:eastAsia="zh-CN"/>
-        </w:rPr>
-        <w:t xml:space="preserve">se </w:t>
-      </w:r>
-      <w:r>
-        <w:rPr>
-          <w:lang w:eastAsia="zh-CN"/>
-        </w:rPr>
-        <w:t>studies</w:t>
-      </w:r>
-      <w:r>
-        <w:rPr>
-          <w:rFonts w:hint="eastAsia"/>
-          <w:lang w:eastAsia="zh-CN"/>
-        </w:rPr>
-        <w:t>.</w:t>
-      </w:r>
-    </w:p>
-    <w:p>
-      <w:pPr>
-        <w:pStyle w:val="Heading2"/>
-        <w:tabs>
-          <w:tab w:val="clear" w:pos="18pt"/>
-          <w:tab w:val="num" w:pos="14.40pt"/>
-        </w:tabs>
-      </w:pPr>
-      <w:r>
-        <w:t>Dataset and Evaluation</w:t>
-      </w:r>
-    </w:p>
-    <w:p>
-      <w:pPr>
-        <w:pStyle w:val="BodyText"/>
-        <w:rPr>
-          <w:lang w:val="en-CA" w:eastAsia="zh-CN"/>
-        </w:rPr>
-      </w:pPr>
-      <w:r>
-        <w:rPr>
-          <w:lang w:val="en-CA" w:eastAsia="zh-CN"/>
-        </w:rPr>
-        <w:t xml:space="preserve">There are a few datasets frequently used. </w:t>
-      </w:r>
-      <w:r>
-        <w:rPr>
-          <w:lang w:val="en-CA" w:eastAsia="zh-CN"/>
-        </w:rPr>
-        <w:t>PMC-</w:t>
-      </w:r>
-      <w:proofErr w:type="gramStart"/>
-      <w:r>
-        <w:rPr>
-          <w:lang w:val="en-CA" w:eastAsia="zh-CN"/>
-        </w:rPr>
-        <w:t>OA[</w:t>
-      </w:r>
-      <w:proofErr w:type="gramEnd"/>
-      <w:r>
-        <w:rPr>
-          <w:lang w:val="en-CA" w:eastAsia="zh-CN"/>
-        </w:rPr>
-        <w:t>45] is a dataset with 1.6M image-caption pairs.</w:t>
-      </w:r>
-      <w:r>
-        <w:rPr>
-          <w:lang w:val="en-CA" w:eastAsia="zh-CN"/>
-        </w:rPr>
-        <w:t xml:space="preserve"> </w:t>
-      </w:r>
-      <w:r>
-        <w:rPr>
-          <w:lang w:val="en-CA" w:eastAsia="zh-CN"/>
-        </w:rPr>
-        <w:t>VQA-</w:t>
-      </w:r>
-      <w:proofErr w:type="gramStart"/>
-      <w:r>
-        <w:rPr>
-          <w:lang w:val="en-CA" w:eastAsia="zh-CN"/>
-        </w:rPr>
-        <w:t>RAD[</w:t>
-      </w:r>
-      <w:proofErr w:type="gramEnd"/>
-      <w:r>
-        <w:rPr>
-          <w:lang w:val="en-CA" w:eastAsia="zh-CN"/>
-        </w:rPr>
-        <w:t xml:space="preserve">46] and </w:t>
-      </w:r>
-      <w:proofErr w:type="spellStart"/>
-      <w:r>
-        <w:rPr>
-          <w:lang w:val="en-CA" w:eastAsia="zh-CN"/>
-        </w:rPr>
-        <w:t>PathVQA</w:t>
-      </w:r>
-      <w:proofErr w:type="spellEnd"/>
-      <w:r>
-        <w:rPr>
-          <w:lang w:val="en-CA" w:eastAsia="zh-CN"/>
-        </w:rPr>
-        <w:t xml:space="preserve">[37] are two datasets for visual question answering. </w:t>
-      </w:r>
-      <w:proofErr w:type="gramStart"/>
-      <w:r>
-        <w:rPr>
-          <w:lang w:val="en-CA" w:eastAsia="zh-CN"/>
-        </w:rPr>
-        <w:t>SLAKE[</w:t>
-      </w:r>
-      <w:proofErr w:type="gramEnd"/>
-      <w:r>
-        <w:rPr>
-          <w:lang w:val="en-CA" w:eastAsia="zh-CN"/>
-        </w:rPr>
-        <w:t xml:space="preserve">41] is another visual QA dataset in multiple medical fields. </w:t>
-      </w:r>
-      <w:proofErr w:type="gramStart"/>
-      <w:r>
-        <w:rPr>
-          <w:lang w:val="en-CA" w:eastAsia="zh-CN"/>
-        </w:rPr>
-        <w:t>USMLE[</w:t>
-      </w:r>
-      <w:proofErr w:type="gramEnd"/>
-      <w:r>
-        <w:rPr>
-          <w:lang w:val="en-CA" w:eastAsia="zh-CN"/>
-        </w:rPr>
-        <w:t>50]</w:t>
-      </w:r>
-      <w:r>
-        <w:rPr>
-          <w:lang w:val="en-CA" w:eastAsia="zh-CN"/>
-        </w:rPr>
-        <w:t xml:space="preserve"> contains 11K MCQ question-answer pairs collected from the United States Medical License Exams. MIMIC-CXR and </w:t>
-      </w:r>
-      <w:proofErr w:type="spellStart"/>
-      <w:proofErr w:type="gramStart"/>
-      <w:r>
-        <w:rPr>
-          <w:lang w:val="en-CA" w:eastAsia="zh-CN"/>
-        </w:rPr>
-        <w:t>CheXpert</w:t>
-      </w:r>
-      <w:proofErr w:type="spellEnd"/>
-      <w:r>
-        <w:rPr>
-          <w:lang w:val="en-CA" w:eastAsia="zh-CN"/>
-        </w:rPr>
-        <w:t>[</w:t>
-      </w:r>
-      <w:proofErr w:type="gramEnd"/>
-      <w:r>
-        <w:rPr>
-          <w:lang w:val="en-CA" w:eastAsia="zh-CN"/>
-        </w:rPr>
-        <w:t>59] are two datasets with chest radiograph images.</w:t>
-      </w:r>
-    </w:p>
-    <w:p>
-      <w:pPr>
-        <w:pStyle w:val="BodyText"/>
-        <w:rPr>
-          <w:lang w:eastAsia="zh-CN"/>
-        </w:rPr>
-      </w:pPr>
-    </w:p>
-    <w:p>
-      <w:pPr>
-        <w:pStyle w:val="BodyText"/>
-        <w:rPr>
-          <w:lang w:eastAsia="zh-CN"/>
-        </w:rPr>
-      </w:pPr>
-    </w:p>
-    <w:p>
-      <w:pPr>
-        <w:pStyle w:val="Heading1"/>
-      </w:pPr>
-      <w:r>
-        <w:t xml:space="preserve">Prepare Your Paper </w:t>
-      </w:r>
-      <w:r>
-        <w:t>Before</w:t>
-      </w:r>
-      <w:r>
-        <w:t xml:space="preserve"> Styling</w:t>
-      </w:r>
-    </w:p>
-    <w:p>
-      <w:pPr>
-        <w:rPr>
-          <w:lang w:eastAsia="zh-CN"/>
-        </w:rPr>
-      </w:pPr>
-    </w:p>
-    <w:p>
-      <w:pPr>
-        <w:pStyle w:val="Heading2"/>
-        <w:numPr>
-          <w:ilvl w:val="0"/>
-          <w:numId w:val="0"/>
-        </w:numPr>
-        <w:rPr>
-          <w:lang w:eastAsia="zh-CN"/>
-        </w:rPr>
-        <w:sectPr>
-          <w:type w:val="continuous"/>
-          <w:pgSz w:w="595.30pt" w:h="841.90pt" w:code="9"/>
-          <w:pgMar w:top="54pt" w:right="45.35pt" w:bottom="72pt" w:left="45.35pt" w:header="36pt" w:footer="36pt" w:gutter="0pt"/>
-          <w:cols w:num="2" w:space="18pt"/>
-          <w:docGrid w:linePitch="360"/>
-        </w:sectPr>
-      </w:pPr>
-      <w:r>
-        <w:rPr>
-          <w:lang w:eastAsia="zh-CN"/>
-        </w:rPr>
+        <w:t xml:space="preserve">diffusion models are </w:t>
+      </w:r>
+      <w:r>
+        <w:rPr>
+          <w:lang w:eastAsia="zh-CN"/>
+        </w:rPr>
+        <w:lastRenderedPageBreak/>
         <w:drawing>
-          <wp:anchor distT="45720" distB="45720" distL="114300" distR="114300" simplePos="0" relativeHeight="251663872" behindDoc="0" locked="0" layoutInCell="1" allowOverlap="1" wp14:anchorId="754733E6" wp14:editId="33413AC2">
+          <wp:anchor distT="45720" distB="45720" distL="114300" distR="114300" simplePos="0" relativeHeight="251663872" behindDoc="0" locked="0" layoutInCell="1" allowOverlap="1" wp14:anchorId="754733E6" wp14:editId="116C95EB">
             <wp:simplePos x="0" y="0"/>
-            <wp:positionH relativeFrom="column">
-              <wp:align>left</wp:align>
+            <wp:positionH relativeFrom="margin">
+              <wp:align>right</wp:align>
             </wp:positionH>
             <wp:positionV relativeFrom="paragraph">
-              <wp:posOffset>244475</wp:posOffset>
+              <wp:posOffset>258330</wp:posOffset>
             </wp:positionV>
             <wp:extent cx="6336665" cy="4768850"/>
             <wp:effectExtent l="0" t="0" r="26035" b="12700"/>
@@ -4469,27 +3978,14 @@
                         <w:r>
                           <w:t xml:space="preserve">Table </w:t>
                         </w:r>
-                        <w:r>
-                          <w:fldChar w:fldCharType="begin"/>
-                        </w:r>
-                        <w:r>
-                          <w:instrText xml:space="preserve"> SEQ Table \* ARABIC </w:instrText>
-                        </w:r>
-                        <w:r>
-                          <w:fldChar w:fldCharType="separate"/>
-                        </w:r>
-                        <w:r>
-                          <w:rPr>
-                            <w:noProof/>
-                          </w:rPr>
-                          <w:t>2</w:t>
-                        </w:r>
-                        <w:r>
-                          <w:rPr>
-                            <w:noProof/>
-                          </w:rPr>
-                          <w:fldChar w:fldCharType="end"/>
-                        </w:r>
+                        <w:fldSimple w:instr=" SEQ Table \* ARABIC ">
+                          <w:r>
+                            <w:rPr>
+                              <w:noProof/>
+                            </w:rPr>
+                            <w:t>2</w:t>
+                          </w:r>
+                        </w:fldSimple>
                         <w:r>
                           <w:rPr>
                             <w:rFonts w:hint="eastAsia"/>
@@ -4522,6 +4018,7 @@
                               <w:pPr>
                                 <w:pStyle w:val="BodyText"/>
                                 <w:ind w:firstLine="0pt"/>
+                                <w:jc w:val="center"/>
                                 <w:rPr>
                                   <w:lang w:eastAsia="zh-CN"/>
                                 </w:rPr>
@@ -4568,6 +4065,7 @@
                               <w:pPr>
                                 <w:pStyle w:val="BodyText"/>
                                 <w:ind w:firstLine="0pt"/>
+                                <w:jc w:val="center"/>
                                 <w:rPr>
                                   <w:lang w:eastAsia="zh-CN"/>
                                 </w:rPr>
@@ -4593,6 +4091,7 @@
                               <w:pPr>
                                 <w:pStyle w:val="BodyText"/>
                                 <w:ind w:firstLine="0pt"/>
+                                <w:jc w:val="center"/>
                                 <w:rPr>
                                   <w:lang w:eastAsia="zh-CN"/>
                                 </w:rPr>
@@ -4623,6 +4122,7 @@
                               <w:pPr>
                                 <w:pStyle w:val="BodyText"/>
                                 <w:ind w:firstLine="0pt"/>
+                                <w:jc w:val="center"/>
                                 <w:rPr>
                                   <w:lang w:eastAsia="zh-CN"/>
                                 </w:rPr>
@@ -4645,6 +4145,7 @@
                               <w:pPr>
                                 <w:pStyle w:val="BodyText"/>
                                 <w:ind w:firstLine="0pt"/>
+                                <w:jc w:val="center"/>
                                 <w:rPr>
                                   <w:lang w:eastAsia="zh-CN"/>
                                 </w:rPr>
@@ -4667,6 +4168,7 @@
                               <w:pPr>
                                 <w:pStyle w:val="BodyText"/>
                                 <w:ind w:firstLine="0pt"/>
+                                <w:jc w:val="center"/>
                                 <w:rPr>
                                   <w:lang w:eastAsia="zh-CN"/>
                                 </w:rPr>
@@ -4694,6 +4196,7 @@
                               <w:pPr>
                                 <w:pStyle w:val="BodyText"/>
                                 <w:ind w:firstLine="0pt"/>
+                                <w:jc w:val="center"/>
                                 <w:rPr>
                                   <w:lang w:eastAsia="zh-CN"/>
                                 </w:rPr>
@@ -4716,6 +4219,7 @@
                               <w:pPr>
                                 <w:pStyle w:val="BodyText"/>
                                 <w:ind w:firstLine="0pt"/>
+                                <w:jc w:val="center"/>
                                 <w:rPr>
                                   <w:lang w:eastAsia="zh-CN"/>
                                 </w:rPr>
@@ -4738,6 +4242,7 @@
                               <w:pPr>
                                 <w:pStyle w:val="BodyText"/>
                                 <w:ind w:firstLine="0pt"/>
+                                <w:jc w:val="center"/>
                                 <w:rPr>
                                   <w:lang w:eastAsia="zh-CN"/>
                                 </w:rPr>
@@ -4765,6 +4270,7 @@
                               <w:pPr>
                                 <w:pStyle w:val="BodyText"/>
                                 <w:ind w:firstLine="0pt"/>
+                                <w:jc w:val="center"/>
                                 <w:rPr>
                                   <w:lang w:eastAsia="zh-CN"/>
                                 </w:rPr>
@@ -4787,6 +4293,7 @@
                               <w:pPr>
                                 <w:pStyle w:val="BodyText"/>
                                 <w:ind w:firstLine="0pt"/>
+                                <w:jc w:val="center"/>
                                 <w:rPr>
                                   <w:lang w:eastAsia="zh-CN"/>
                                 </w:rPr>
@@ -4835,6 +4342,7 @@
                               <w:pPr>
                                 <w:pStyle w:val="BodyText"/>
                                 <w:ind w:firstLine="0pt"/>
+                                <w:jc w:val="center"/>
                                 <w:rPr>
                                   <w:lang w:eastAsia="zh-CN"/>
                                 </w:rPr>
@@ -4871,6 +4379,7 @@
                               <w:pPr>
                                 <w:pStyle w:val="BodyText"/>
                                 <w:ind w:firstLine="0pt"/>
+                                <w:jc w:val="center"/>
                                 <w:rPr>
                                   <w:lang w:eastAsia="zh-CN"/>
                                 </w:rPr>
@@ -4893,6 +4402,7 @@
                               <w:pPr>
                                 <w:pStyle w:val="BodyText"/>
                                 <w:ind w:firstLine="0pt"/>
+                                <w:jc w:val="center"/>
                                 <w:rPr>
                                   <w:lang w:eastAsia="zh-CN"/>
                                 </w:rPr>
@@ -4915,6 +4425,7 @@
                               <w:pPr>
                                 <w:pStyle w:val="BodyText"/>
                                 <w:ind w:firstLine="0pt"/>
+                                <w:jc w:val="center"/>
                                 <w:rPr>
                                   <w:lang w:eastAsia="zh-CN"/>
                                 </w:rPr>
@@ -4942,6 +4453,7 @@
                               <w:pPr>
                                 <w:pStyle w:val="BodyText"/>
                                 <w:ind w:firstLine="0pt"/>
+                                <w:jc w:val="center"/>
                                 <w:rPr>
                                   <w:lang w:eastAsia="zh-CN"/>
                                 </w:rPr>
@@ -4964,6 +4476,7 @@
                               <w:pPr>
                                 <w:pStyle w:val="BodyText"/>
                                 <w:ind w:firstLine="0pt"/>
+                                <w:jc w:val="center"/>
                                 <w:rPr>
                                   <w:lang w:eastAsia="zh-CN"/>
                                 </w:rPr>
@@ -4986,6 +4499,7 @@
                               <w:pPr>
                                 <w:pStyle w:val="BodyText"/>
                                 <w:ind w:firstLine="0pt"/>
+                                <w:jc w:val="center"/>
                                 <w:rPr>
                                   <w:lang w:eastAsia="zh-CN"/>
                                 </w:rPr>
@@ -5013,6 +4527,7 @@
                               <w:pPr>
                                 <w:pStyle w:val="BodyText"/>
                                 <w:ind w:firstLine="0pt"/>
+                                <w:jc w:val="center"/>
                                 <w:rPr>
                                   <w:lang w:eastAsia="zh-CN"/>
                                 </w:rPr>
@@ -5035,6 +4550,7 @@
                               <w:pPr>
                                 <w:pStyle w:val="BodyText"/>
                                 <w:ind w:firstLine="0pt"/>
+                                <w:jc w:val="center"/>
                                 <w:rPr>
                                   <w:lang w:eastAsia="zh-CN"/>
                                 </w:rPr>
@@ -5057,6 +4573,7 @@
                               <w:pPr>
                                 <w:pStyle w:val="BodyText"/>
                                 <w:ind w:firstLine="0pt"/>
+                                <w:jc w:val="center"/>
                                 <w:rPr>
                                   <w:lang w:eastAsia="zh-CN"/>
                                 </w:rPr>
@@ -5084,6 +4601,7 @@
                               <w:pPr>
                                 <w:pStyle w:val="BodyText"/>
                                 <w:ind w:firstLine="0pt"/>
+                                <w:jc w:val="center"/>
                                 <w:rPr>
                                   <w:lang w:eastAsia="zh-CN"/>
                                 </w:rPr>
@@ -5105,6 +4623,7 @@
                               <w:pPr>
                                 <w:pStyle w:val="BodyText"/>
                                 <w:ind w:firstLine="0pt"/>
+                                <w:jc w:val="center"/>
                                 <w:rPr>
                                   <w:sz w:val="16"/>
                                   <w:szCs w:val="16"/>
@@ -5130,6 +4649,7 @@
                               <w:pPr>
                                 <w:pStyle w:val="BodyText"/>
                                 <w:ind w:firstLine="0pt"/>
+                                <w:jc w:val="center"/>
                                 <w:rPr>
                                   <w:sz w:val="16"/>
                                   <w:szCs w:val="16"/>
@@ -5160,6 +4680,7 @@
                               <w:pPr>
                                 <w:pStyle w:val="BodyText"/>
                                 <w:ind w:firstLine="0pt"/>
+                                <w:jc w:val="center"/>
                                 <w:rPr>
                                   <w:lang w:eastAsia="zh-CN"/>
                                 </w:rPr>
@@ -5181,6 +4702,7 @@
                               <w:pPr>
                                 <w:pStyle w:val="BodyText"/>
                                 <w:ind w:firstLine="0pt"/>
+                                <w:jc w:val="center"/>
                                 <w:rPr>
                                   <w:sz w:val="16"/>
                                   <w:szCs w:val="16"/>
@@ -5206,6 +4728,7 @@
                               <w:pPr>
                                 <w:pStyle w:val="BodyText"/>
                                 <w:ind w:firstLine="0pt"/>
+                                <w:jc w:val="center"/>
                                 <w:rPr>
                                   <w:sz w:val="16"/>
                                   <w:szCs w:val="16"/>
@@ -5219,7 +4742,7 @@
                                   <w:sz w:val="16"/>
                                   <w:szCs w:val="16"/>
                                 </w:rPr>
-                                <w:t xml:space="preserve">The performance is highly dependent on the knowledge graph, and it is usually expensive to construct a high-quality knowledge graph. </w:t>
+                                <w:t>The performance is highly dependent on the knowledge graph, and it is usually expensive to construct a high-quality knowledge graph.</w:t>
                               </w:r>
                             </w:p>
                           </w:tc>
@@ -5236,6 +4759,7 @@
                               <w:pPr>
                                 <w:pStyle w:val="BodyText"/>
                                 <w:ind w:firstLine="0pt"/>
+                                <w:jc w:val="center"/>
                                 <w:rPr>
                                   <w:lang w:eastAsia="zh-CN"/>
                                 </w:rPr>
@@ -5257,6 +4781,7 @@
                               <w:pPr>
                                 <w:pStyle w:val="BodyText"/>
                                 <w:ind w:firstLine="0pt"/>
+                                <w:jc w:val="center"/>
                                 <w:rPr>
                                   <w:sz w:val="16"/>
                                   <w:szCs w:val="16"/>
@@ -5270,9 +4795,25 @@
                                   <w:sz w:val="16"/>
                                   <w:szCs w:val="16"/>
                                 </w:rPr>
-                                <w:t xml:space="preserve">The performance of various LLM gets improved equipped with </w:t>
-                              </w:r>
-                              <w:proofErr w:type="spellStart"/>
+                                <w:t>The performance of various LLM gets improved equipped with BuimedRAG</w:t>
+                              </w:r>
+                            </w:p>
+                          </w:tc>
+                          <w:tc>
+                            <w:tcPr>
+                              <w:tcW w:w="40.0%" w:type="pct"/>
+                            </w:tcPr>
+                            <w:p>
+                              <w:pPr>
+                                <w:pStyle w:val="BodyText"/>
+                                <w:ind w:firstLine="0pt"/>
+                                <w:jc w:val="center"/>
+                                <w:rPr>
+                                  <w:sz w:val="16"/>
+                                  <w:szCs w:val="16"/>
+                                  <w:lang w:eastAsia="zh-CN"/>
+                                </w:rPr>
+                              </w:pPr>
                               <w:r>
                                 <w:rPr>
                                   <w:rFonts w:hint="eastAsia"/>
@@ -5280,73 +4821,7 @@
                                   <w:sz w:val="16"/>
                                   <w:szCs w:val="16"/>
                                 </w:rPr>
-                                <w:t>BuimedRAG</w:t>
-                              </w:r>
-                              <w:proofErr w:type="spellEnd"/>
-                            </w:p>
-                          </w:tc>
-                          <w:tc>
-                            <w:tcPr>
-                              <w:tcW w:w="40.0%" w:type="pct"/>
-                            </w:tcPr>
-                            <w:p>
-                              <w:pPr>
-                                <w:pStyle w:val="BodyText"/>
-                                <w:ind w:firstLine="0pt"/>
-                                <w:rPr>
-                                  <w:sz w:val="16"/>
-                                  <w:szCs w:val="16"/>
-                                  <w:lang w:eastAsia="zh-CN"/>
-                                </w:rPr>
-                              </w:pPr>
-                              <w:r>
-                                <w:rPr>
-                                  <w:rFonts w:hint="eastAsia"/>
-                                  <w:color w:val="000000"/>
-                                  <w:sz w:val="16"/>
-                                  <w:szCs w:val="16"/>
-                                </w:rPr>
-                                <w:t xml:space="preserve">Word chunks are not good at preserving semantical relationships; the RAG </w:t>
-                              </w:r>
-                              <w:proofErr w:type="spellStart"/>
-                              <w:r>
-                                <w:rPr>
-                                  <w:rFonts w:hint="eastAsia"/>
-                                  <w:color w:val="000000"/>
-                                  <w:sz w:val="16"/>
-                                  <w:szCs w:val="16"/>
-                                </w:rPr>
-                                <w:t>retreival</w:t>
-                              </w:r>
-                              <w:proofErr w:type="spellEnd"/>
-                              <w:r>
-                                <w:rPr>
-                                  <w:rFonts w:hint="eastAsia"/>
-                                  <w:color w:val="000000"/>
-                                  <w:sz w:val="16"/>
-                                  <w:szCs w:val="16"/>
-                                </w:rPr>
-                                <w:t xml:space="preserve"> dataset is </w:t>
-                              </w:r>
-                              <w:proofErr w:type="spellStart"/>
-                              <w:r>
-                                <w:rPr>
-                                  <w:rFonts w:hint="eastAsia"/>
-                                  <w:color w:val="000000"/>
-                                  <w:sz w:val="16"/>
-                                  <w:szCs w:val="16"/>
-                                </w:rPr>
-                                <w:t>simplely</w:t>
-                              </w:r>
-                              <w:proofErr w:type="spellEnd"/>
-                              <w:r>
-                                <w:rPr>
-                                  <w:rFonts w:hint="eastAsia"/>
-                                  <w:color w:val="000000"/>
-                                  <w:sz w:val="16"/>
-                                  <w:szCs w:val="16"/>
-                                </w:rPr>
-                                <w:t xml:space="preserve"> built using validation set and lack of generalization. </w:t>
+                                <w:t>Word chunks are not good at preserving semantical relationships; the RAG retreival dataset is simplely built using validation set and lack of generalization.</w:t>
                               </w:r>
                             </w:p>
                           </w:tc>
@@ -5363,6 +4838,7 @@
                               <w:pPr>
                                 <w:pStyle w:val="BodyText"/>
                                 <w:ind w:firstLine="0pt"/>
+                                <w:jc w:val="center"/>
                                 <w:rPr>
                                   <w:lang w:eastAsia="zh-CN"/>
                                 </w:rPr>
@@ -5384,6 +4860,7 @@
                               <w:pPr>
                                 <w:pStyle w:val="BodyText"/>
                                 <w:ind w:firstLine="0pt"/>
+                                <w:jc w:val="center"/>
                                 <w:rPr>
                                   <w:sz w:val="16"/>
                                   <w:szCs w:val="16"/>
@@ -5409,6 +4886,7 @@
                               <w:pPr>
                                 <w:pStyle w:val="BodyText"/>
                                 <w:ind w:firstLine="0pt"/>
+                                <w:jc w:val="center"/>
                                 <w:rPr>
                                   <w:sz w:val="16"/>
                                   <w:szCs w:val="16"/>
@@ -5422,27 +4900,7 @@
                                   <w:sz w:val="16"/>
                                   <w:szCs w:val="16"/>
                                 </w:rPr>
-                                <w:t xml:space="preserve">The model was </w:t>
-                              </w:r>
-                              <w:proofErr w:type="spellStart"/>
-                              <w:r>
-                                <w:rPr>
-                                  <w:rFonts w:hint="eastAsia"/>
-                                  <w:color w:val="000000"/>
-                                  <w:sz w:val="16"/>
-                                  <w:szCs w:val="16"/>
-                                </w:rPr>
-                                <w:t>trainined</w:t>
-                              </w:r>
-                              <w:proofErr w:type="spellEnd"/>
-                              <w:r>
-                                <w:rPr>
-                                  <w:rFonts w:hint="eastAsia"/>
-                                  <w:color w:val="000000"/>
-                                  <w:sz w:val="16"/>
-                                  <w:szCs w:val="16"/>
-                                </w:rPr>
-                                <w:t xml:space="preserve"> using general domain dataset, efforts required to adapt medical domain knowledge.</w:t>
+                                <w:t>The model was trainined using general domain dataset, efforts required to adapt medical domain knowledge.</w:t>
                               </w:r>
                             </w:p>
                           </w:tc>
@@ -5459,6 +4917,7 @@
                               <w:pPr>
                                 <w:pStyle w:val="BodyText"/>
                                 <w:ind w:firstLine="0pt"/>
+                                <w:jc w:val="center"/>
                                 <w:rPr>
                                   <w:lang w:eastAsia="zh-CN"/>
                                 </w:rPr>
@@ -5480,6 +4939,7 @@
                               <w:pPr>
                                 <w:pStyle w:val="BodyText"/>
                                 <w:ind w:firstLine="0pt"/>
+                                <w:jc w:val="center"/>
                                 <w:rPr>
                                   <w:sz w:val="16"/>
                                   <w:szCs w:val="16"/>
@@ -5505,6 +4965,7 @@
                               <w:pPr>
                                 <w:pStyle w:val="BodyText"/>
                                 <w:ind w:firstLine="0pt"/>
+                                <w:jc w:val="center"/>
                                 <w:rPr>
                                   <w:sz w:val="16"/>
                                   <w:szCs w:val="16"/>
@@ -5542,18 +5003,586 @@
           </wp:anchor>
         </w:drawing>
       </w:r>
+      <w:r>
+        <w:rPr>
+          <w:rFonts w:hint="eastAsia"/>
+          <w:lang w:eastAsia="zh-CN"/>
+        </w:rPr>
+        <w:t xml:space="preserve">widely used for synthesis. </w:t>
+      </w:r>
+      <w:r>
+        <w:rPr>
+          <w:rFonts w:hint="eastAsia"/>
+          <w:lang w:eastAsia="zh-CN"/>
+        </w:rPr>
+        <w:t>[27]</w:t>
+      </w:r>
+      <w:r>
+        <w:rPr>
+          <w:rFonts w:hint="eastAsia"/>
+          <w:lang w:eastAsia="zh-CN"/>
+        </w:rPr>
+        <w:t xml:space="preserve"> proposed MediSyn, a text-guided LDM-based image synthesizing model for multiple medical fields.</w:t>
+      </w:r>
+      <w:r>
+        <w:rPr>
+          <w:rFonts w:hint="eastAsia"/>
+          <w:lang w:eastAsia="zh-CN"/>
+        </w:rPr>
+        <w:t xml:space="preserve"> [25</w:t>
+      </w:r>
+      <w:r>
+        <w:rPr>
+          <w:rFonts w:hint="eastAsia"/>
+          <w:lang w:eastAsia="zh-CN"/>
+        </w:rPr>
+        <w:t>,26,28</w:t>
+      </w:r>
+      <w:r>
+        <w:rPr>
+          <w:rFonts w:hint="eastAsia"/>
+          <w:lang w:eastAsia="zh-CN"/>
+        </w:rPr>
+        <w:t>]</w:t>
+      </w:r>
+      <w:r>
+        <w:rPr>
+          <w:rFonts w:hint="eastAsia"/>
+          <w:lang w:eastAsia="zh-CN"/>
+        </w:rPr>
+        <w:t xml:space="preserve"> are other diffusion-based model</w:t>
+      </w:r>
+      <w:r>
+        <w:rPr>
+          <w:lang w:eastAsia="zh-CN"/>
+        </w:rPr>
+        <w:t>s</w:t>
+      </w:r>
+      <w:r>
+        <w:rPr>
+          <w:rFonts w:hint="eastAsia"/>
+          <w:lang w:eastAsia="zh-CN"/>
+        </w:rPr>
+        <w:t xml:space="preserve"> in various medical fields. </w:t>
+      </w:r>
+      <w:r>
+        <w:rPr>
+          <w:rFonts w:hint="eastAsia"/>
+          <w:lang w:eastAsia="zh-CN"/>
+        </w:rPr>
+        <w:t xml:space="preserve">The alignment of text and vision input is vital for </w:t>
+      </w:r>
+      <w:r>
+        <w:rPr>
+          <w:lang w:eastAsia="zh-CN"/>
+        </w:rPr>
+        <w:t xml:space="preserve">the </w:t>
+      </w:r>
+      <w:r>
+        <w:rPr>
+          <w:rFonts w:hint="eastAsia"/>
+          <w:lang w:eastAsia="zh-CN"/>
+        </w:rPr>
+        <w:t xml:space="preserve">fidelity of generated images. </w:t>
+      </w:r>
+      <w:r>
+        <w:rPr>
+          <w:rFonts w:hint="eastAsia"/>
+          <w:lang w:eastAsia="zh-CN"/>
+        </w:rPr>
+        <w:t>[29]</w:t>
+      </w:r>
+      <w:r>
+        <w:rPr>
+          <w:rFonts w:hint="eastAsia"/>
+          <w:lang w:eastAsia="zh-CN"/>
+        </w:rPr>
+        <w:t xml:space="preserve"> proposed a vision-language pretraining framework for multimodal alignment in </w:t>
+      </w:r>
+      <w:r>
+        <w:rPr>
+          <w:lang w:eastAsia="zh-CN"/>
+        </w:rPr>
+        <w:t xml:space="preserve">the </w:t>
+      </w:r>
+      <w:r>
+        <w:rPr>
+          <w:rFonts w:hint="eastAsia"/>
+          <w:lang w:eastAsia="zh-CN"/>
+        </w:rPr>
+        <w:t>medical field.</w:t>
+      </w:r>
+      <w:r>
+        <w:rPr>
+          <w:rFonts w:hint="eastAsia"/>
+          <w:lang w:eastAsia="zh-CN"/>
+        </w:rPr>
+        <w:t xml:space="preserve"> Table 3 shows the comparison among tho</w:t>
+      </w:r>
+      <w:r>
+        <w:rPr>
+          <w:rFonts w:hint="eastAsia"/>
+          <w:lang w:eastAsia="zh-CN"/>
+        </w:rPr>
+        <w:t xml:space="preserve">se </w:t>
+      </w:r>
+      <w:r>
+        <w:rPr>
+          <w:lang w:eastAsia="zh-CN"/>
+        </w:rPr>
+        <w:t>studies</w:t>
+      </w:r>
+      <w:r>
+        <w:rPr>
+          <w:rFonts w:hint="eastAsia"/>
+          <w:lang w:eastAsia="zh-CN"/>
+        </w:rPr>
+        <w:t>.</w:t>
+      </w:r>
+    </w:p>
+    <w:p>
+      <w:pPr>
+        <w:pStyle w:val="Heading2"/>
+        <w:tabs>
+          <w:tab w:val="clear" w:pos="18pt"/>
+          <w:tab w:val="num" w:pos="14.40pt"/>
+        </w:tabs>
+      </w:pPr>
+      <w:r>
+        <w:t>Dataset and Evaluation</w:t>
+      </w:r>
+    </w:p>
+    <w:p>
+      <w:pPr>
+        <w:pStyle w:val="BodyText"/>
+        <w:rPr>
+          <w:lang w:eastAsia="zh-CN"/>
+        </w:rPr>
+      </w:pPr>
+      <w:r>
+        <w:rPr>
+          <w:lang w:val="en-CA" w:eastAsia="zh-CN"/>
+        </w:rPr>
+        <w:t xml:space="preserve">There are a few datasets frequently used. </w:t>
+      </w:r>
+      <w:r>
+        <w:rPr>
+          <w:lang w:val="en-CA" w:eastAsia="zh-CN"/>
+        </w:rPr>
+        <w:t>PMC-OA[45] is a dataset with 1.6M image-caption pairs.</w:t>
+      </w:r>
+      <w:r>
+        <w:rPr>
+          <w:lang w:val="en-CA" w:eastAsia="zh-CN"/>
+        </w:rPr>
+        <w:t xml:space="preserve"> </w:t>
+      </w:r>
+      <w:r>
+        <w:rPr>
+          <w:lang w:val="en-CA" w:eastAsia="zh-CN"/>
+        </w:rPr>
+        <w:t>VQA-RAD[46] and PathVQA[37] are two datasets for visual question answering. SLAKE[41] is another visual QA dataset in multiple medical fields. USMLE[50]</w:t>
+      </w:r>
+      <w:r>
+        <w:rPr>
+          <w:lang w:val="en-CA" w:eastAsia="zh-CN"/>
+        </w:rPr>
+        <w:t xml:space="preserve"> contains 11K MCQ question-answer pairs collected from the United States Medical License Exams. MIMIC-CXR and CheXpert[59] are two datasets with chest radiograph images.</w:t>
+      </w:r>
+      <w:r>
+        <w:rPr>
+          <w:rFonts w:hint="eastAsia"/>
+          <w:lang w:val="en-CA" w:eastAsia="zh-CN"/>
+        </w:rPr>
+        <w:t xml:space="preserve"> Kvasir</w:t>
+      </w:r>
+      <w:r>
+        <w:rPr>
+          <w:rFonts w:hint="eastAsia"/>
+          <w:lang w:val="en-CA" w:eastAsia="zh-CN"/>
+        </w:rPr>
+        <w:t xml:space="preserve">[66] provides images from </w:t>
+      </w:r>
+      <w:r>
+        <w:rPr>
+          <w:lang w:val="en-CA" w:eastAsia="zh-CN"/>
+        </w:rPr>
+        <w:t>inside</w:t>
+      </w:r>
+      <w:r>
+        <w:rPr>
+          <w:rFonts w:hint="eastAsia"/>
+          <w:lang w:val="en-CA" w:eastAsia="zh-CN"/>
+        </w:rPr>
+        <w:t xml:space="preserve"> the gastrointestinal</w:t>
+      </w:r>
+      <w:r>
+        <w:rPr>
+          <w:rFonts w:hint="eastAsia"/>
+          <w:lang w:val="en-CA" w:eastAsia="zh-CN"/>
+        </w:rPr>
+        <w:t xml:space="preserve"> (GI)</w:t>
+      </w:r>
+      <w:r>
+        <w:rPr>
+          <w:rFonts w:hint="eastAsia"/>
+          <w:lang w:val="en-CA" w:eastAsia="zh-CN"/>
+        </w:rPr>
+        <w:t xml:space="preserve"> tract.</w:t>
+      </w:r>
+      <w:r>
+        <w:rPr>
+          <w:rFonts w:hint="eastAsia"/>
+          <w:lang w:val="en-CA" w:eastAsia="zh-CN"/>
+        </w:rPr>
+        <w:t xml:space="preserve"> In this project, we will focus our research on the GI domain.</w:t>
+      </w:r>
+    </w:p>
+    <w:p>
+      <w:pPr>
+        <w:pStyle w:val="Heading1"/>
+        <w:rPr>
+          <w:lang w:eastAsia="zh-CN"/>
+        </w:rPr>
+      </w:pPr>
+      <w:r>
+        <w:rPr>
+          <w:rFonts w:hint="eastAsia"/>
+          <w:lang w:eastAsia="zh-CN"/>
+        </w:rPr>
+        <w:t>System Architecture and Data Preparation</w:t>
+      </w:r>
+    </w:p>
+    <w:p>
+      <w:pPr>
+        <w:pStyle w:val="Heading2"/>
+        <w:rPr>
+          <w:lang w:eastAsia="zh-CN"/>
+        </w:rPr>
+      </w:pPr>
+      <w:r>
+        <w:rPr>
+          <w:rFonts w:hint="eastAsia"/>
+          <w:lang w:eastAsia="zh-CN"/>
+        </w:rPr>
+        <w:t>System Architecture</w:t>
+      </w:r>
+    </w:p>
+    <w:p>
+      <w:pPr>
+        <w:jc w:val="both"/>
+        <w:rPr>
+          <w:lang w:eastAsia="zh-CN"/>
+        </w:rPr>
+      </w:pPr>
+      <w:r>
+        <w:rPr>
+          <w:rFonts w:hint="eastAsia"/>
+          <w:lang w:eastAsia="zh-CN"/>
+        </w:rPr>
+        <w:t xml:space="preserve">The proposed system defines a pipeline for visualizing </w:t>
+      </w:r>
+      <w:r>
+        <w:rPr>
+          <w:lang w:eastAsia="zh-CN"/>
+        </w:rPr>
+        <w:t>question</w:t>
+      </w:r>
+      <w:r>
+        <w:rPr>
+          <w:rFonts w:hint="eastAsia"/>
+          <w:lang w:eastAsia="zh-CN"/>
+        </w:rPr>
+        <w:t xml:space="preserve"> answers. Figure 1 illustrates the architecture. </w:t>
+      </w:r>
+      <w:r>
+        <w:rPr>
+          <w:rFonts w:hint="eastAsia"/>
+          <w:lang w:eastAsia="zh-CN"/>
+        </w:rPr>
+        <w:t>This pipeline includes the following stages:</w:t>
+      </w:r>
+    </w:p>
+    <w:p>
+      <w:pPr>
+        <w:pStyle w:val="Heading3"/>
+        <w:rPr>
+          <w:i w:val="0"/>
+          <w:iCs w:val="0"/>
+          <w:lang w:val="en-CA" w:eastAsia="zh-CN"/>
+        </w:rPr>
+      </w:pPr>
+      <w:r>
+        <w:rPr>
+          <w:lang w:val="en-CA" w:eastAsia="zh-CN"/>
+        </w:rPr>
+        <w:t>User-provided</w:t>
+      </w:r>
+      <w:r>
+        <w:rPr>
+          <w:rFonts w:hint="eastAsia"/>
+          <w:lang w:val="en-CA" w:eastAsia="zh-CN"/>
+        </w:rPr>
+        <w:t xml:space="preserve"> questions: </w:t>
+      </w:r>
+      <w:r>
+        <w:rPr>
+          <w:i w:val="0"/>
+          <w:iCs w:val="0"/>
+          <w:lang w:val="en-CA" w:eastAsia="zh-CN"/>
+        </w:rPr>
+        <w:t>The user</w:t>
+      </w:r>
+      <w:r>
+        <w:rPr>
+          <w:rFonts w:hint="eastAsia"/>
+          <w:i w:val="0"/>
+          <w:iCs w:val="0"/>
+          <w:lang w:val="en-CA" w:eastAsia="zh-CN"/>
+        </w:rPr>
+        <w:t xml:space="preserve"> provides queries in natu</w:t>
+      </w:r>
+      <w:r>
+        <w:rPr>
+          <w:rFonts w:hint="eastAsia"/>
+          <w:i w:val="0"/>
+          <w:iCs w:val="0"/>
+          <w:lang w:val="en-CA" w:eastAsia="zh-CN"/>
+        </w:rPr>
+        <w:t>r</w:t>
+      </w:r>
+      <w:r>
+        <w:rPr>
+          <w:rFonts w:hint="eastAsia"/>
+          <w:i w:val="0"/>
+          <w:iCs w:val="0"/>
+          <w:lang w:val="en-CA" w:eastAsia="zh-CN"/>
+        </w:rPr>
+        <w:t>al lan</w:t>
+      </w:r>
+      <w:r>
+        <w:rPr>
+          <w:rFonts w:hint="eastAsia"/>
+          <w:i w:val="0"/>
+          <w:iCs w:val="0"/>
+          <w:lang w:val="en-CA" w:eastAsia="zh-CN"/>
+        </w:rPr>
+        <w:t>guage.</w:t>
+      </w:r>
+      <w:r>
+        <w:rPr>
+          <w:rFonts w:hint="eastAsia"/>
+          <w:i w:val="0"/>
+          <w:iCs w:val="0"/>
+          <w:lang w:val="en-CA" w:eastAsia="zh-CN"/>
+        </w:rPr>
+        <w:t xml:space="preserve"> </w:t>
+      </w:r>
+      <w:r>
+        <w:rPr>
+          <w:i w:val="0"/>
+          <w:iCs w:val="0"/>
+          <w:lang w:val="en-CA" w:eastAsia="zh-CN"/>
+        </w:rPr>
+        <w:t>An</w:t>
+      </w:r>
+      <w:r>
+        <w:rPr>
+          <w:rFonts w:hint="eastAsia"/>
+          <w:i w:val="0"/>
+          <w:iCs w:val="0"/>
+          <w:lang w:val="en-CA" w:eastAsia="zh-CN"/>
+        </w:rPr>
+        <w:t xml:space="preserve"> LLM is employed to convert the query to the PICO format.</w:t>
+      </w:r>
+    </w:p>
+    <w:p>
+      <w:pPr>
+        <w:pStyle w:val="Heading3"/>
+        <w:rPr>
+          <w:i w:val="0"/>
+          <w:iCs w:val="0"/>
+          <w:lang w:val="en-CA" w:eastAsia="zh-CN"/>
+        </w:rPr>
+      </w:pPr>
+      <w:r>
+        <w:rPr>
+          <w:rFonts w:hint="eastAsia"/>
+          <w:lang w:val="en-CA" w:eastAsia="zh-CN"/>
+        </w:rPr>
+        <w:t xml:space="preserve">Context Retrieval: </w:t>
+      </w:r>
+      <w:r>
+        <w:rPr>
+          <w:rFonts w:hint="eastAsia"/>
+          <w:i w:val="0"/>
+          <w:iCs w:val="0"/>
+          <w:lang w:val="en-CA" w:eastAsia="zh-CN"/>
+        </w:rPr>
+        <w:t>The PICO-format questions are used to query relevant documents from the vector store.</w:t>
+      </w:r>
+    </w:p>
+    <w:p>
+      <w:pPr>
+        <w:pStyle w:val="Heading3"/>
+        <w:rPr>
+          <w:i w:val="0"/>
+          <w:iCs w:val="0"/>
+          <w:lang w:val="en-CA" w:eastAsia="zh-CN"/>
+        </w:rPr>
+      </w:pPr>
+      <w:r>
+        <w:rPr>
+          <w:rFonts w:hint="eastAsia"/>
+          <w:lang w:val="en-CA" w:eastAsia="zh-CN"/>
+        </w:rPr>
+        <w:t xml:space="preserve">Answer Generate: </w:t>
+      </w:r>
+      <w:r>
+        <w:rPr>
+          <w:rFonts w:hint="eastAsia"/>
+          <w:i w:val="0"/>
+          <w:iCs w:val="0"/>
+          <w:lang w:val="en-CA" w:eastAsia="zh-CN"/>
+        </w:rPr>
+        <w:t>The context text and original query are combined into a prompt for the QA model. The QA model will generate the answer.</w:t>
+      </w:r>
+    </w:p>
+    <w:p>
+      <w:pPr>
+        <w:pStyle w:val="Heading3"/>
+        <w:rPr>
+          <w:i w:val="0"/>
+          <w:iCs w:val="0"/>
+          <w:lang w:val="en-CA" w:eastAsia="zh-CN"/>
+        </w:rPr>
+      </w:pPr>
+      <w:r>
+        <w:rPr>
+          <w:rFonts w:hint="eastAsia"/>
+          <w:lang w:val="en-CA" w:eastAsia="zh-CN"/>
+        </w:rPr>
+        <w:t xml:space="preserve">Response Visualization: </w:t>
+      </w:r>
+      <w:r>
+        <w:rPr>
+          <w:rFonts w:hint="eastAsia"/>
+          <w:i w:val="0"/>
+          <w:iCs w:val="0"/>
+          <w:lang w:val="en-CA" w:eastAsia="zh-CN"/>
+        </w:rPr>
+        <w:t>T</w:t>
+      </w:r>
+      <w:r>
+        <w:rPr>
+          <w:i w:val="0"/>
+          <w:iCs w:val="0"/>
+          <w:lang w:val="en-CA" w:eastAsia="zh-CN"/>
+        </w:rPr>
+        <w:t>h</w:t>
+      </w:r>
+      <w:r>
+        <w:rPr>
+          <w:rFonts w:hint="eastAsia"/>
+          <w:i w:val="0"/>
+          <w:iCs w:val="0"/>
+          <w:lang w:val="en-CA" w:eastAsia="zh-CN"/>
+        </w:rPr>
+        <w:t>e text answer will be analyzed by the visualization module. Depending on the content, if a colonoscope image is implied, it will be generated by a finetuned text-to-image model; if a flowchart or other type of diagram is implied, MermaidJS API will be called to generate the image from the intermediate code generated by another LLM.</w:t>
+      </w:r>
+      <w:r>
+        <w:rPr>
+          <w:rFonts w:hint="eastAsia"/>
+          <w:i w:val="0"/>
+          <w:iCs w:val="0"/>
+          <w:lang w:val="en-CA" w:eastAsia="zh-CN"/>
+        </w:rPr>
+        <w:t xml:space="preserve"> In both cases, the answer text will be used as a key to retrieve the vector database for presaved images.</w:t>
+      </w:r>
+    </w:p>
+    <w:p>
+      <w:pPr>
+        <w:pStyle w:val="Heading3"/>
+        <w:rPr>
+          <w:rFonts w:hint="eastAsia"/>
+          <w:lang w:val="en-CA" w:eastAsia="zh-CN"/>
+        </w:rPr>
+      </w:pPr>
+      <w:r>
+        <w:rPr>
+          <w:rFonts w:hint="eastAsia"/>
+          <w:lang w:val="en-CA" w:eastAsia="zh-CN"/>
+        </w:rPr>
+        <w:t xml:space="preserve">Answer Editor: </w:t>
+      </w:r>
+      <w:r>
+        <w:rPr>
+          <w:rFonts w:hint="eastAsia"/>
+          <w:i w:val="0"/>
+          <w:iCs w:val="0"/>
+          <w:lang w:val="en-CA" w:eastAsia="zh-CN"/>
+        </w:rPr>
+        <w:t xml:space="preserve">As the final stage, the answer editor will organize the text and visual content to generate a </w:t>
+      </w:r>
+      <w:r>
+        <w:rPr>
+          <w:rFonts w:hint="eastAsia"/>
+          <w:i w:val="0"/>
+          <w:iCs w:val="0"/>
+          <w:lang w:val="en-CA" w:eastAsia="zh-CN"/>
+        </w:rPr>
+        <w:t>well-</w:t>
+      </w:r>
+      <w:r>
+        <w:rPr>
+          <w:rFonts w:hint="eastAsia"/>
+          <w:i w:val="0"/>
+          <w:iCs w:val="0"/>
+          <w:lang w:val="en-CA" w:eastAsia="zh-CN"/>
+        </w:rPr>
+        <w:t>formatted result.</w:t>
+      </w:r>
+    </w:p>
+    <w:p>
+      <w:pPr>
+        <w:rPr>
+          <w:lang w:val="en-CA" w:eastAsia="zh-CN"/>
+        </w:rPr>
+      </w:pPr>
+    </w:p>
+    <w:p>
+      <w:pPr>
+        <w:pStyle w:val="Heading2"/>
+        <w:numPr>
+          <w:ilvl w:val="0"/>
+          <w:numId w:val="0"/>
+        </w:numPr>
+        <w:rPr>
+          <w:lang w:val="en-CA" w:eastAsia="zh-CN"/>
+        </w:rPr>
+        <w:sectPr>
+          <w:type w:val="continuous"/>
+          <w:pgSz w:w="595.30pt" w:h="841.90pt" w:code="9"/>
+          <w:pgMar w:top="54pt" w:right="45.35pt" w:bottom="72pt" w:left="45.35pt" w:header="36pt" w:footer="36pt" w:gutter="0pt"/>
+          <w:cols w:num="2" w:space="18pt"/>
+          <w:docGrid w:linePitch="360"/>
+        </w:sectPr>
+      </w:pPr>
     </w:p>
     <w:p>
       <w:pPr>
         <w:jc w:val="start"/>
         <w:rPr>
-          <w:lang w:eastAsia="zh-CN"/>
+          <w:lang w:val="en-CA" w:eastAsia="zh-CN"/>
         </w:rPr>
       </w:pPr>
     </w:p>
     <w:p>
       <w:pPr>
         <w:jc w:val="start"/>
+        <w:rPr>
+          <w:lang w:val="en-CA"/>
+        </w:rPr>
       </w:pPr>
       <w:r>
         <w:rPr>
@@ -5615,27 +5644,14 @@
                         <w:r>
                           <w:t xml:space="preserve">Table </w:t>
                         </w:r>
-                        <w:r>
-                          <w:fldChar w:fldCharType="begin"/>
-                        </w:r>
-                        <w:r>
-                          <w:instrText xml:space="preserve"> SEQ Table \* ARABIC </w:instrText>
-                        </w:r>
-                        <w:r>
-                          <w:fldChar w:fldCharType="separate"/>
-                        </w:r>
-                        <w:r>
-                          <w:rPr>
-                            <w:noProof/>
-                          </w:rPr>
-                          <w:t>3</w:t>
-                        </w:r>
-                        <w:r>
-                          <w:rPr>
-                            <w:noProof/>
-                          </w:rPr>
-                          <w:fldChar w:fldCharType="end"/>
-                        </w:r>
+                        <w:fldSimple w:instr=" SEQ Table \* ARABIC ">
+                          <w:r>
+                            <w:rPr>
+                              <w:noProof/>
+                            </w:rPr>
+                            <w:t>3</w:t>
+                          </w:r>
+                        </w:fldSimple>
                         <w:r>
                           <w:rPr>
                             <w:rFonts w:hint="eastAsia"/>
@@ -5914,27 +5930,7 @@
                                   <w:szCs w:val="16"/>
                                 </w:rPr>
                                 <w:br/>
-                                <w:t xml:space="preserve">The image generation depended on the visual </w:t>
-                              </w:r>
-                              <w:proofErr w:type="spellStart"/>
-                              <w:r>
-                                <w:rPr>
-                                  <w:rFonts w:hint="eastAsia"/>
-                                  <w:color w:val="000000"/>
-                                  <w:sz w:val="16"/>
-                                  <w:szCs w:val="16"/>
-                                </w:rPr>
-                                <w:t>symption</w:t>
-                              </w:r>
-                              <w:proofErr w:type="spellEnd"/>
-                              <w:r>
-                                <w:rPr>
-                                  <w:rFonts w:hint="eastAsia"/>
-                                  <w:color w:val="000000"/>
-                                  <w:sz w:val="16"/>
-                                  <w:szCs w:val="16"/>
-                                </w:rPr>
-                                <w:t xml:space="preserve"> generator.</w:t>
+                                <w:t>The image generation depended on the visual symption generator.</w:t>
                               </w:r>
                             </w:p>
                           </w:tc>
@@ -6162,27 +6158,7 @@
                                   <w:sz w:val="16"/>
                                   <w:szCs w:val="16"/>
                                 </w:rPr>
-                                <w:t xml:space="preserve">The model was trained and evaluated using radiological </w:t>
-                              </w:r>
-                              <w:proofErr w:type="spellStart"/>
-                              <w:r>
-                                <w:rPr>
-                                  <w:rFonts w:hint="eastAsia"/>
-                                  <w:color w:val="000000"/>
-                                  <w:sz w:val="16"/>
-                                  <w:szCs w:val="16"/>
-                                </w:rPr>
-                                <w:t>data,and</w:t>
-                              </w:r>
-                              <w:proofErr w:type="spellEnd"/>
-                              <w:r>
-                                <w:rPr>
-                                  <w:rFonts w:hint="eastAsia"/>
-                                  <w:color w:val="000000"/>
-                                  <w:sz w:val="16"/>
-                                  <w:szCs w:val="16"/>
-                                </w:rPr>
-                                <w:t xml:space="preserve"> it is unknown how to would perform in other medical fields.</w:t>
+                                <w:t>The model was trained and evaluated using radiological data,and it is unknown how to would perform in other medical fields.</w:t>
                               </w:r>
                             </w:p>
                           </w:tc>
@@ -6678,27 +6654,7 @@
                                   <w:sz w:val="16"/>
                                   <w:szCs w:val="16"/>
                                 </w:rPr>
-                                <w:t xml:space="preserve">Imagen showed limitations when generating images of </w:t>
-                              </w:r>
-                              <w:proofErr w:type="spellStart"/>
-                              <w:r>
-                                <w:rPr>
-                                  <w:rFonts w:hint="eastAsia"/>
-                                  <w:color w:val="000000"/>
-                                  <w:sz w:val="16"/>
-                                  <w:szCs w:val="16"/>
-                                </w:rPr>
-                                <w:t>people,and</w:t>
-                              </w:r>
-                              <w:proofErr w:type="spellEnd"/>
-                              <w:r>
-                                <w:rPr>
-                                  <w:rFonts w:hint="eastAsia"/>
-                                  <w:color w:val="000000"/>
-                                  <w:sz w:val="16"/>
-                                  <w:szCs w:val="16"/>
-                                </w:rPr>
-                                <w:t xml:space="preserve"> its effectiveness in medical image synthesis is unknown.</w:t>
+                                <w:t>Imagen showed limitations when generating images of people,and its effectiveness in medical image synthesis is unknown.</w:t>
                               </w:r>
                             </w:p>
                           </w:tc>
@@ -6809,7 +6765,7 @@
     <w:p>
       <w:pPr>
         <w:rPr>
-          <w:lang w:eastAsia="zh-CN"/>
+          <w:lang w:val="en-CA" w:eastAsia="zh-CN"/>
         </w:rPr>
         <w:sectPr>
           <w:pgSz w:w="595.30pt" w:h="841.90pt" w:code="9"/>
@@ -6823,7 +6779,7 @@
       <w:pPr>
         <w:jc w:val="start"/>
         <w:rPr>
-          <w:lang w:eastAsia="zh-CN"/>
+          <w:lang w:val="en-CA" w:eastAsia="zh-CN"/>
         </w:rPr>
       </w:pPr>
     </w:p>
@@ -6831,7 +6787,7 @@
       <w:pPr>
         <w:jc w:val="start"/>
         <w:rPr>
-          <w:lang w:eastAsia="zh-CN"/>
+          <w:lang w:val="en-CA" w:eastAsia="zh-CN"/>
         </w:rPr>
         <w:sectPr>
           <w:type w:val="continuous"/>
@@ -6845,19 +6801,57 @@
     <w:p>
       <w:pPr>
         <w:jc w:val="start"/>
-      </w:pPr>
-      <w:r>
+        <w:rPr>
+          <w:lang w:val="en-CA"/>
+        </w:rPr>
+      </w:pPr>
+    </w:p>
+    <w:p>
+      <w:pPr>
+        <w:jc w:val="both"/>
+        <w:rPr>
+          <w:rFonts w:hint="eastAsia"/>
+          <w:lang w:val="en-CA" w:eastAsia="zh-CN"/>
+        </w:rPr>
+        <w:sectPr>
+          <w:type w:val="continuous"/>
+          <w:pgSz w:w="595.30pt" w:h="841.90pt" w:code="9"/>
+          <w:pgMar w:top="54pt" w:right="45.35pt" w:bottom="72pt" w:left="45.35pt" w:header="36pt" w:footer="36pt" w:gutter="0pt"/>
+          <w:cols w:num="2" w:space="18pt"/>
+          <w:docGrid w:linePitch="360"/>
+        </w:sectPr>
+      </w:pPr>
+    </w:p>
+    <w:p>
+      <w:pPr>
+        <w:jc w:val="start"/>
+        <w:rPr>
+          <w:rFonts w:hint="eastAsia"/>
+          <w:lang w:val="en-CA" w:eastAsia="zh-CN"/>
+        </w:rPr>
+        <w:sectPr>
+          <w:type w:val="continuous"/>
+          <w:pgSz w:w="595.30pt" w:h="841.90pt" w:code="9"/>
+          <w:pgMar w:top="54pt" w:right="45.35pt" w:bottom="72pt" w:left="45.35pt" w:header="36pt" w:footer="36pt" w:gutter="0pt"/>
+          <w:cols w:space="18pt"/>
+          <w:docGrid w:linePitch="360"/>
+        </w:sectPr>
+      </w:pPr>
+      <w:r>
+        <w:rPr>
+          <w:noProof/>
+        </w:rPr>
         <w:drawing>
-          <wp:anchor distT="45720" distB="45720" distL="114300" distR="114300" simplePos="0" relativeHeight="251667968" behindDoc="0" locked="0" layoutInCell="1" allowOverlap="1" wp14:anchorId="0814CB0E" wp14:editId="6E38F8A8">
+          <wp:anchor distT="45720" distB="45720" distL="114300" distR="114300" simplePos="0" relativeHeight="251667968" behindDoc="0" locked="0" layoutInCell="1" allowOverlap="1" wp14:anchorId="0814CB0E" wp14:editId="62421C1A">
             <wp:simplePos x="0" y="0"/>
             <wp:positionH relativeFrom="margin">
               <wp:align>right</wp:align>
             </wp:positionH>
             <wp:positionV relativeFrom="paragraph">
-              <wp:posOffset>201295</wp:posOffset>
+              <wp:posOffset>55245</wp:posOffset>
             </wp:positionV>
-            <wp:extent cx="6381750" cy="2292350"/>
-            <wp:effectExtent l="0" t="0" r="0" b="0"/>
+            <wp:extent cx="6381750" cy="2576830"/>
+            <wp:effectExtent l="0" t="0" r="19050" b="13970"/>
             <wp:wrapSquare wrapText="bothSides"/>
             <wp:docPr id="15595385" name="Text Box 2"/>
             <wp:cNvGraphicFramePr>
@@ -6872,7 +6866,7 @@
                   <wp:spPr bwMode="auto">
                     <a:xfrm>
                       <a:off x="0" y="0"/>
-                      <a:ext cx="6381750" cy="2292350"/>
+                      <a:ext cx="6381750" cy="2576830"/>
                     </a:xfrm>
                     <a:prstGeom prst="rect">
                       <a:avLst/>
@@ -6881,7 +6875,9 @@
                       <a:srgbClr val="FFFFFF"/>
                     </a:solidFill>
                     <a:ln w="9525">
-                      <a:noFill/>
+                      <a:solidFill>
+                        <a:schemeClr val="tx1"/>
+                      </a:solidFill>
                       <a:miter lim="800%"/>
                       <a:headEnd/>
                       <a:tailEnd/>
@@ -6896,24 +6892,14 @@
                         <w:r>
                           <w:t xml:space="preserve">Figure </w:t>
                         </w:r>
-                        <w:r>
-                          <w:fldChar w:fldCharType="begin"/>
-                        </w:r>
-                        <w:r>
-                          <w:instrText xml:space="preserve"> SEQ Figure \* ARABIC </w:instrText>
-                        </w:r>
-                        <w:r>
-                          <w:fldChar w:fldCharType="separate"/>
-                        </w:r>
-                        <w:r>
-                          <w:rPr>
-                            <w:noProof/>
-                          </w:rPr>
-                          <w:t>1</w:t>
-                        </w:r>
-                        <w:r>
-                          <w:fldChar w:fldCharType="end"/>
-                        </w:r>
+                        <w:fldSimple w:instr=" SEQ Figure \* ARABIC ">
+                          <w:r>
+                            <w:rPr>
+                              <w:noProof/>
+                            </w:rPr>
+                            <w:t>1</w:t>
+                          </w:r>
+                        </w:fldSimple>
                         <w:r>
                           <w:t xml:space="preserve"> System Structure</w:t>
                         </w:r>
@@ -6933,10 +6919,10 @@
                             <w:lang w:val="en-CA"/>
                           </w:rPr>
                           <w:drawing>
-                            <wp:inline distT="0" distB="0" distL="0" distR="0" wp14:anchorId="3053CBCA" wp14:editId="7820A8C2">
-                              <wp:extent cx="4523509" cy="1990897"/>
-                              <wp:effectExtent l="0" t="0" r="0" b="0"/>
-                              <wp:docPr id="2114024940" name="Picture 6" descr="A diagram of a problem&#10;&#10;Description automatically generated with medium confidence"/>
+                            <wp:inline distT="0" distB="0" distL="0" distR="0" wp14:anchorId="572C3512" wp14:editId="3E7C8E79">
+                              <wp:extent cx="5821680" cy="2192020"/>
+                              <wp:effectExtent l="0" t="0" r="7620" b="0"/>
+                              <wp:docPr id="1982722131" name="Picture 6" descr="A screenshot of a computer&#10;&#10;Description automatically generated"/>
                               <wp:cNvGraphicFramePr>
                                 <a:graphicFrameLocks xmlns:a="http://purl.oclc.org/ooxml/drawingml/main" noChangeAspect="1"/>
                               </wp:cNvGraphicFramePr>
@@ -6944,7 +6930,7 @@
                                 <a:graphicData uri="http://purl.oclc.org/ooxml/drawingml/picture">
                                   <pic:pic xmlns:pic="http://purl.oclc.org/ooxml/drawingml/picture">
                                     <pic:nvPicPr>
-                                      <pic:cNvPr id="2114024940" name="Picture 6" descr="A diagram of a problem&#10;&#10;Description automatically generated with medium confidence"/>
+                                      <pic:cNvPr id="1982722131" name="Picture 6" descr="A screenshot of a computer&#10;&#10;Description automatically generated"/>
                                       <pic:cNvPicPr/>
                                     </pic:nvPicPr>
                                     <pic:blipFill>
@@ -6962,7 +6948,7 @@
                                     <pic:spPr>
                                       <a:xfrm>
                                         <a:off x="0" y="0"/>
-                                        <a:ext cx="4539541" cy="1997953"/>
+                                        <a:ext cx="5821680" cy="2192020"/>
                                       </a:xfrm>
                                       <a:prstGeom prst="rect">
                                         <a:avLst/>
@@ -6995,900 +6981,29 @@
     </w:p>
     <w:p>
       <w:pPr>
-        <w:sectPr>
-          <w:type w:val="continuous"/>
-          <w:pgSz w:w="595.30pt" w:h="841.90pt" w:code="9"/>
-          <w:pgMar w:top="54pt" w:right="45.35pt" w:bottom="72pt" w:left="45.35pt" w:header="36pt" w:footer="36pt" w:gutter="0pt"/>
-          <w:cols w:num="2" w:space="18pt"/>
-          <w:docGrid w:linePitch="360"/>
-        </w:sectPr>
-      </w:pPr>
-    </w:p>
-    <w:p>
-      <w:pPr>
-        <w:jc w:val="start"/>
-      </w:pPr>
-    </w:p>
-    <w:p>
-      <w:pPr>
-        <w:jc w:val="start"/>
-        <w:sectPr>
-          <w:type w:val="continuous"/>
-          <w:pgSz w:w="595.30pt" w:h="841.90pt" w:code="9"/>
-          <w:pgMar w:top="54pt" w:right="45.35pt" w:bottom="72pt" w:left="45.35pt" w:header="36pt" w:footer="36pt" w:gutter="0pt"/>
-          <w:cols w:space="18pt"/>
-          <w:docGrid w:linePitch="360"/>
-        </w:sectPr>
-      </w:pPr>
-    </w:p>
-    <w:p>
-      <w:pPr>
-        <w:jc w:val="start"/>
-      </w:pPr>
-    </w:p>
-    <w:p>
-      <w:pPr>
-        <w:pStyle w:val="Heading2"/>
-      </w:pPr>
-      <w:r>
-        <w:t>Abbreviations</w:t>
-      </w:r>
-      <w:r>
-        <w:t xml:space="preserve"> and Acronyms</w:t>
-      </w:r>
-    </w:p>
-    <w:p>
-      <w:pPr>
-        <w:pStyle w:val="Heading2"/>
-      </w:pPr>
-      <w:r>
-        <w:t>Define abbreviations and acronyms the first time they are used in the text, even after they have been defined in the abstract. Abbreviations such as IEEE, SI, MKS, CGS, sc, dc, and rms do not have to be defined. Do not use abbreviations in the title or heads unless they are unavoidable.</w:t>
-      </w:r>
-      <w:r>
-        <w:t xml:space="preserve"> </w:t>
-      </w:r>
-      <w:r>
-        <w:t>Units</w:t>
-      </w:r>
-    </w:p>
-    <w:p>
-      <w:pPr>
-        <w:pStyle w:val="Heading2"/>
-      </w:pPr>
-      <w:r>
-        <w:rPr>
-          <w:rFonts w:hint="eastAsia"/>
-          <w:lang w:eastAsia="zh-CN"/>
-        </w:rPr>
-        <w:t>E</w:t>
-      </w:r>
-      <w:r>
-        <w:t>quations</w:t>
-      </w:r>
-    </w:p>
-    <w:p>
-      <w:pPr>
-        <w:pStyle w:val="equation"/>
-        <w:rPr>
-          <w:rFonts w:hint="eastAsia"/>
-        </w:rPr>
-      </w:pPr>
-      <w:r>
-        <w:tab/>
-      </w:r>
-      <w:r>
-        <w:rPr>
-          <w:rFonts w:ascii="Times New Roman" w:hAnsi="Times New Roman" w:cs="Times New Roman"/>
-          <w:i/>
-        </w:rPr>
-        <w:t>a</w:t>
-      </w:r>
-      <w:r>
-        <w:t></w:t>
-      </w:r>
-      <w:r>
-        <w:t></w:t>
-      </w:r>
-      <w:r>
-        <w:t></w:t>
-      </w:r>
-      <w:r>
-        <w:rPr>
-          <w:rFonts w:ascii="Times New Roman" w:hAnsi="Times New Roman" w:cs="Times New Roman"/>
-          <w:i/>
-        </w:rPr>
-        <w:t>b</w:t>
-      </w:r>
-      <w:r>
-        <w:t></w:t>
-      </w:r>
-      <w:r>
-        <w:t></w:t>
-      </w:r>
-      <w:r>
-        <w:t></w:t>
-      </w:r>
-      <w:r>
-        <w:t></w:t>
-      </w:r>
-      <w:r>
-        <w:t></w:t>
-      </w:r>
-      <w:r>
-        <w:tab/>
-      </w:r>
-      <w:r>
-        <w:t></w:t>
-      </w:r>
-      <w:r>
-        <w:t></w:t>
-      </w:r>
-      <w:r>
-        <w:t></w:t>
-      </w:r>
-    </w:p>
-    <w:p>
-      <w:pPr>
         <w:pStyle w:val="BodyText"/>
-        <w:rPr>
-          <w:lang w:eastAsia="zh-CN"/>
-        </w:rPr>
-      </w:pPr>
-      <w:r>
-        <w:t xml:space="preserve">Note that the equation is centered using a center tab stop. Be sure that the symbols in your equation have been defined before or immediately following the equation. Use “(1)”, not </w:t>
-      </w:r>
-      <w:r>
-        <w:rPr>
-          <w:rFonts w:hint="eastAsia"/>
-          <w:lang w:eastAsia="zh-CN"/>
-        </w:rPr>
-        <w:t xml:space="preserve">a good ides a  </w:t>
-      </w:r>
-      <w:r>
-        <w:t xml:space="preserve">he symbols in your equation have been defined before or immediately following the equation. Use “(1)”, not </w:t>
-      </w:r>
-      <w:r>
-        <w:rPr>
-          <w:rFonts w:hint="eastAsia"/>
-          <w:lang w:eastAsia="zh-CN"/>
-        </w:rPr>
-        <w:t>a good ides a</w:t>
+        <w:ind w:firstLine="0pt"/>
+        <w:rPr>
+          <w:rFonts w:hint="eastAsia"/>
+          <w:lang w:eastAsia="zh-CN"/>
+        </w:rPr>
+      </w:pPr>
+    </w:p>
+    <w:p>
+      <w:pPr>
+        <w:pStyle w:val="Heading1"/>
+      </w:pPr>
+      <w:r>
+        <w:t xml:space="preserve">Using the </w:t>
+      </w:r>
+      <w:r>
+        <w:t>Template</w:t>
       </w:r>
     </w:p>
     <w:p>
       <w:pPr>
         <w:pStyle w:val="BodyText"/>
       </w:pPr>
-      <w:r>
-        <w:t>“Eq. (1)” or “equation (1)”, except at the beginning of a sentence: “Equation (1) is . . .”</w:t>
-      </w:r>
-    </w:p>
-    <w:p>
-      <w:pPr>
-        <w:pStyle w:val="Heading2"/>
-      </w:pPr>
-      <w:r>
-        <w:t>Some Common Mistakes</w:t>
-      </w:r>
-    </w:p>
-    <w:p>
-      <w:pPr>
-        <w:pStyle w:val="bulletlist"/>
-      </w:pPr>
-      <w:r>
-        <w:t>The word “data” is plural, not singular.</w:t>
-      </w:r>
-    </w:p>
-    <w:p>
-      <w:pPr>
-        <w:pStyle w:val="bulletlist"/>
-      </w:pPr>
-      <w:r>
-        <w:t xml:space="preserve">The subscript for the permeability of vacuum </w:t>
-      </w:r>
-      <w:r>
-        <w:rPr>
-          <w:rFonts w:ascii="Symbol" w:hAnsi="Symbol" w:cs="Symbol"/>
-          <w:i/>
-          <w:iCs/>
-          <w:snapToGrid w:val="0"/>
-        </w:rPr>
-        <w:t></w:t>
-      </w:r>
-      <w:r>
-        <w:rPr>
-          <w:vertAlign w:val="subscript"/>
-        </w:rPr>
-        <w:t>0</w:t>
-      </w:r>
-      <w:r>
-        <w:t>, and other common scientific constants, is zero with subscript formatting, not a lowercase letter “o”.</w:t>
-      </w:r>
-    </w:p>
-    <w:p>
-      <w:pPr>
-        <w:pStyle w:val="bulletlist"/>
-      </w:pPr>
-      <w:r>
-        <w:t xml:space="preserve">In American </w:t>
-      </w:r>
-      <w:r>
-        <w:t>English, commas, semi</w:t>
-      </w:r>
-      <w:r>
-        <w:t xml:space="preserve">colons, periods, question and exclamation marks are located within quotation marks only when a complete thought or name is cited, such as a title or full quotation. When quotation marks are used, instead of a bold or italic </w:t>
-      </w:r>
-    </w:p>
-    <w:p>
-      <w:pPr>
-        <w:pStyle w:val="bulletlist"/>
-        <w:numPr>
-          <w:ilvl w:val="0"/>
-          <w:numId w:val="0"/>
-        </w:numPr>
-        <w:ind w:start="28.80pt"/>
-      </w:pPr>
-      <w:r>
-        <w:t>typeface, to highlight a word or phrase, punctuation should appear outside of the quotation marks. A parenthetical phrase or statement at the end of a sentence is punctuated outside of the closing parenthesis (like this). (A parenthetical sentence is punctuated within the parentheses.)</w:t>
-      </w:r>
-    </w:p>
-    <w:p>
-      <w:pPr>
-        <w:pStyle w:val="bulletlist"/>
-      </w:pPr>
-      <w:r>
-        <w:t>A graph within a graph is an “inset”, not an “insert”. The word alternatively is preferred to the word “alternately” (unless you really mean something that alternates).</w:t>
-      </w:r>
-    </w:p>
-    <w:p>
-      <w:pPr>
-        <w:pStyle w:val="bulletlist"/>
-      </w:pPr>
-      <w:r>
-        <w:t>Do not use the word “essentially” to mean “approximately” or “effectively”.</w:t>
-      </w:r>
-    </w:p>
-    <w:p>
-      <w:pPr>
-        <w:pStyle w:val="bulletlist"/>
-      </w:pPr>
-      <w:r>
-        <w:t>In your paper title, if the words “that uses” can accurately replace the word “using”, capitalize the “u”; if not, keep using lower-cased.</w:t>
-      </w:r>
-    </w:p>
-    <w:p>
-      <w:pPr>
-        <w:pStyle w:val="bulletlist"/>
-      </w:pPr>
-      <w:r>
-        <w:t>Be aware of the different meanings of the homophones “affect” and “effect”, “complement” and “compliment”, “discreet” and “discrete”, “principal” and “principle”.</w:t>
-      </w:r>
-    </w:p>
-    <w:p>
-      <w:pPr>
-        <w:pStyle w:val="bulletlist"/>
-      </w:pPr>
-      <w:r>
-        <w:t>Do not confuse “imply” and “infer”.</w:t>
-      </w:r>
-    </w:p>
-    <w:p>
-      <w:pPr>
-        <w:pStyle w:val="bulletlist"/>
-      </w:pPr>
-      <w:r>
-        <w:t>The prefix “non” is not a word; it should be joined to the word it modifies, usually without a hyphen.</w:t>
-      </w:r>
-    </w:p>
-    <w:p>
-      <w:pPr>
-        <w:pStyle w:val="bulletlist"/>
-      </w:pPr>
-      <w:r>
-        <w:t>There is no period after the “et” in the Latin abbreviation “et al.”.</w:t>
-      </w:r>
-    </w:p>
-    <w:p>
-      <w:pPr>
-        <w:pStyle w:val="bulletlist"/>
-      </w:pPr>
-      <w:r>
-        <w:t>The abbreviation “i.e.” means “that is”, and the abbreviation “e.g.” means “for example”.</w:t>
-      </w:r>
-    </w:p>
-    <w:p>
-      <w:pPr>
-        <w:pStyle w:val="BodyText"/>
-      </w:pPr>
-      <w:r>
-        <w:t>An excellent style manual for science writers is [7].</w:t>
-      </w:r>
-    </w:p>
-    <w:p>
-      <w:pPr>
-        <w:pStyle w:val="Heading1"/>
-      </w:pPr>
-      <w:r>
-        <w:t xml:space="preserve">Using the </w:t>
-      </w:r>
-      <w:r>
-        <w:t>Template</w:t>
-      </w:r>
-    </w:p>
-    <w:p>
-      <w:pPr>
-        <w:pStyle w:val="BodyText"/>
-      </w:pPr>
-      <w:r>
-        <w:t>After the text edit has been completed, the paper is ready for the template. Duplicate the template file by using the Save As command, and use the naming convention prescribed by your conference for the name of your paper. In this newly created file, highlight all of the contents and import your prepared text file. You are now ready to style your paper; use the scroll down window on the left of the MS Word Formatting toolbar.</w:t>
-      </w:r>
-    </w:p>
-    <w:p>
-      <w:pPr>
-        <w:pStyle w:val="Heading2"/>
-      </w:pPr>
-      <w:r>
-        <w:t>Authors</w:t>
-      </w:r>
-      <w:r>
-        <w:t xml:space="preserve"> and Affiliations</w:t>
-      </w:r>
-    </w:p>
-    <w:p>
-      <w:pPr>
-        <w:pStyle w:val="BodyText"/>
-      </w:pPr>
-      <w:r>
-        <w:rPr>
-          <w:b/>
-        </w:rPr>
-        <w:t xml:space="preserve">The template is </w:t>
-      </w:r>
-      <w:r>
-        <w:rPr>
-          <w:b/>
-        </w:rPr>
-        <w:t>designed</w:t>
-      </w:r>
-      <w:r>
-        <w:rPr>
-          <w:b/>
-          <w:lang w:val="en-US"/>
-        </w:rPr>
-        <w:t xml:space="preserve"> for,</w:t>
-      </w:r>
-      <w:r>
-        <w:rPr>
-          <w:b/>
-        </w:rPr>
-        <w:t xml:space="preserve"> but not limited to</w:t>
-      </w:r>
-      <w:r>
-        <w:rPr>
-          <w:b/>
-          <w:lang w:val="en-US"/>
-        </w:rPr>
-        <w:t>,</w:t>
-      </w:r>
-      <w:r>
-        <w:rPr>
-          <w:b/>
-          <w:lang w:val="en-US"/>
-        </w:rPr>
-        <w:t xml:space="preserve"> </w:t>
-      </w:r>
-      <w:r>
-        <w:rPr>
-          <w:b/>
-          <w:lang w:val="en-US"/>
-        </w:rPr>
-        <w:t>six</w:t>
-      </w:r>
-      <w:r>
-        <w:rPr>
-          <w:b/>
-          <w:lang w:val="en-US"/>
-        </w:rPr>
-        <w:t xml:space="preserve"> authors.</w:t>
-      </w:r>
-      <w:r>
-        <w:rPr>
-          <w:lang w:val="en-US"/>
-        </w:rPr>
-        <w:t xml:space="preserve"> </w:t>
-      </w:r>
-      <w:r>
-        <w:rPr>
-          <w:lang w:val="en-US"/>
-        </w:rPr>
-        <w:t xml:space="preserve">A minimum of one author is required for all conference articles. </w:t>
-      </w:r>
-      <w:r>
-        <w:t>Author names should be listed starting from left to right and then moving down to the next line. This is the author sequence that will be used in future citations and by indexing services.</w:t>
-      </w:r>
-      <w:r>
-        <w:t xml:space="preserve"> </w:t>
-      </w:r>
-      <w:r>
-        <w:t>Names should not be listed in columns nor group by affiliation.</w:t>
-      </w:r>
-      <w:r>
-        <w:rPr>
-          <w:lang w:val="en-US"/>
-        </w:rPr>
-        <w:t xml:space="preserve"> </w:t>
-      </w:r>
-      <w:r>
-        <w:t>Please keep your affiliations as succinct as possible (for example, do not differentiate among departments of the same organization).</w:t>
-      </w:r>
-    </w:p>
-    <w:p>
-      <w:pPr>
-        <w:pStyle w:val="Heading3"/>
-      </w:pPr>
-      <w:r>
-        <w:t xml:space="preserve">For papers with more than six authors: </w:t>
-      </w:r>
-      <w:r>
-        <w:rPr>
-          <w:i w:val="0"/>
-        </w:rPr>
-        <w:t>Add author names horizontally, moving to a third row if needed for more than 8 authors.</w:t>
-      </w:r>
-    </w:p>
-    <w:p>
-      <w:pPr>
-        <w:pStyle w:val="Heading3"/>
-      </w:pPr>
-      <w:r>
-        <w:t xml:space="preserve">For </w:t>
-      </w:r>
-      <w:r>
-        <w:t xml:space="preserve">papers with less than </w:t>
-      </w:r>
-      <w:r>
-        <w:t>six</w:t>
-      </w:r>
-      <w:r>
-        <w:t xml:space="preserve"> authors</w:t>
-      </w:r>
-      <w:r>
-        <w:t xml:space="preserve">: </w:t>
-      </w:r>
-      <w:r>
-        <w:rPr>
-          <w:i w:val="0"/>
-        </w:rPr>
-        <w:t>To change the default, adjust the template as follows.</w:t>
-      </w:r>
-    </w:p>
-    <w:p>
-      <w:pPr>
-        <w:pStyle w:val="Heading4"/>
-      </w:pPr>
-      <w:r>
-        <w:t>Selection</w:t>
-      </w:r>
-      <w:r>
-        <w:t xml:space="preserve">: </w:t>
-      </w:r>
-      <w:r>
-        <w:rPr>
-          <w:i w:val="0"/>
-        </w:rPr>
-        <w:t>Highlight all author and affiliation lines.</w:t>
-      </w:r>
-    </w:p>
-    <w:p>
-      <w:pPr>
-        <w:pStyle w:val="Heading4"/>
-      </w:pPr>
-      <w:r>
-        <w:t>Change number of columns:</w:t>
-      </w:r>
-      <w:r>
-        <w:t xml:space="preserve"> </w:t>
-      </w:r>
-      <w:r>
-        <w:rPr>
-          <w:i w:val="0"/>
-        </w:rPr>
-        <w:t xml:space="preserve">Select the Columns icon from the MS Word Standard toolbar and then select </w:t>
-      </w:r>
-      <w:r>
-        <w:rPr>
-          <w:i w:val="0"/>
-        </w:rPr>
-        <w:t>the correct number of columns</w:t>
-      </w:r>
-      <w:r>
-        <w:rPr>
-          <w:i w:val="0"/>
-        </w:rPr>
-        <w:t xml:space="preserve"> from the selection palette.</w:t>
-      </w:r>
-    </w:p>
-    <w:p>
-      <w:pPr>
-        <w:pStyle w:val="Heading4"/>
-        <w:rPr>
-          <w:i w:val="0"/>
-        </w:rPr>
-      </w:pPr>
-      <w:r>
-        <w:t xml:space="preserve">Deletion: </w:t>
-      </w:r>
-      <w:r>
-        <w:rPr>
-          <w:i w:val="0"/>
-        </w:rPr>
-        <w:t xml:space="preserve">Delete the author and affiliation lines for the </w:t>
-      </w:r>
-      <w:r>
-        <w:rPr>
-          <w:i w:val="0"/>
-        </w:rPr>
-        <w:t>extra authors.</w:t>
-      </w:r>
-    </w:p>
-    <w:p>
-      <w:pPr>
-        <w:jc w:val="start"/>
-        <w:rPr>
-          <w:i/>
-          <w:iCs/>
-          <w:noProof/>
-        </w:rPr>
-      </w:pPr>
-    </w:p>
-    <w:p>
-      <w:pPr>
-        <w:pStyle w:val="Heading2"/>
-      </w:pPr>
-      <w:r>
-        <w:t>Identify</w:t>
-      </w:r>
-      <w:r>
-        <w:t xml:space="preserve"> the Headings</w:t>
-      </w:r>
-    </w:p>
-    <w:p>
-      <w:pPr>
-        <w:pStyle w:val="BodyText"/>
-      </w:pPr>
-      <w:r>
-        <w:t>Headings, or heads, are organizational devices that guide the reader through your paper. There are two types: component heads and text heads.</w:t>
-      </w:r>
-    </w:p>
-    <w:p>
-      <w:pPr>
-        <w:pStyle w:val="BodyText"/>
-      </w:pPr>
-      <w:r>
-        <w:t>Component heads identify the different components of your paper and are not topically subordinate to each other. Examples include Acknowledgments and References and, for these, the correct style to use is “Heading 5”. Use “figure caption” for your Figure captions, and “table head” for your table title. Run-in heads, such as “Abstract”, will require you to apply a style (in this case, italic) in addition to the style provided by the drop down menu to differentiate the head from the text.</w:t>
-      </w:r>
-    </w:p>
-    <w:p>
-      <w:pPr>
-        <w:pStyle w:val="BodyText"/>
-      </w:pPr>
-      <w:r>
-        <w:t>Text heads organize the topics on a relational, hierarchical basis. For example, the paper title is the primary text head because all subsequent material relates and elaborates on this one topic. If there are two or more sub-topics, the next level head (uppercase Roman numerals) should be used and, conversely, if there are not at least two sub-topics, then no subheads should be introduced. Styles named “Heading 1”, “Heading 2”, “Heading 3”, and “Heading 4” are prescribed.</w:t>
-      </w:r>
-    </w:p>
-    <w:p>
-      <w:pPr>
-        <w:pStyle w:val="Heading2"/>
-      </w:pPr>
-      <w:r>
-        <w:t>Figures and Tables</w:t>
-      </w:r>
-    </w:p>
-    <w:p>
-      <w:pPr>
-        <w:pStyle w:val="Heading4"/>
-      </w:pPr>
-      <w:r>
-        <w:t xml:space="preserve"> </w:t>
-      </w:r>
-      <w:r>
-        <w:t xml:space="preserve">Positioning Figures and Tables: </w:t>
-      </w:r>
-      <w:r>
-        <w:rPr>
-          <w:i w:val="0"/>
-        </w:rPr>
-        <w:t>Place figures and tables at the top and bottom of columns. Avoid placing them in the middle of columns. Large figures and tables may span across both columns. Figure captions should be below the figures; table heads should appear above the tables. Insert figures and tables after they are cited in the text. Use the abbreviation “Fig. 1”, even at the beginning of a sentence.</w:t>
-      </w:r>
-    </w:p>
-    <w:p>
-      <w:pPr>
-        <w:pStyle w:val="tablehead"/>
-      </w:pPr>
-      <w:r>
-        <w:t>Table Type Styles</w:t>
-      </w:r>
-    </w:p>
-    <w:tbl>
-      <w:tblPr>
-        <w:tblW w:w="0pt" w:type="dxa"/>
-        <w:jc w:val="center"/>
-        <w:tblBorders>
-          <w:top w:val="single" w:sz="2" w:space="0" w:color="auto"/>
-          <w:start w:val="single" w:sz="2" w:space="0" w:color="auto"/>
-          <w:bottom w:val="single" w:sz="2" w:space="0" w:color="auto"/>
-          <w:end w:val="single" w:sz="2" w:space="0" w:color="auto"/>
-          <w:insideH w:val="single" w:sz="2" w:space="0" w:color="auto"/>
-          <w:insideV w:val="single" w:sz="2" w:space="0" w:color="auto"/>
-        </w:tblBorders>
-        <w:tblLayout w:type="fixed"/>
-        <w:tblLook w:firstRow="0" w:lastRow="0" w:firstColumn="0" w:lastColumn="0" w:noHBand="0" w:noVBand="0"/>
-      </w:tblPr>
-      <w:tblGrid>
-        <w:gridCol w:w="720"/>
-        <w:gridCol w:w="2340"/>
-        <w:gridCol w:w="900"/>
-        <w:gridCol w:w="900"/>
-      </w:tblGrid>
-      <w:tr>
-        <w:trPr>
-          <w:cantSplit/>
-          <w:trHeight w:val="240"/>
-          <w:tblHeader/>
-          <w:jc w:val="center"/>
-        </w:trPr>
-        <w:tc>
-          <w:tcPr>
-            <w:tcW w:w="36pt" w:type="dxa"/>
-            <w:vMerge w:val="restart"/>
-            <w:vAlign w:val="center"/>
-          </w:tcPr>
-          <w:p>
-            <w:pPr>
-              <w:pStyle w:val="tablecolhead"/>
-            </w:pPr>
-            <w:r>
-              <w:t>Table Head</w:t>
-            </w:r>
-          </w:p>
-        </w:tc>
-        <w:tc>
-          <w:tcPr>
-            <w:tcW w:w="207pt" w:type="dxa"/>
-            <w:gridSpan w:val="3"/>
-            <w:vAlign w:val="center"/>
-          </w:tcPr>
-          <w:p>
-            <w:pPr>
-              <w:pStyle w:val="tablecolhead"/>
-            </w:pPr>
-            <w:r>
-              <w:t>Table Column Head</w:t>
-            </w:r>
-          </w:p>
-        </w:tc>
-      </w:tr>
-      <w:tr>
-        <w:trPr>
-          <w:cantSplit/>
-          <w:trHeight w:val="240"/>
-          <w:tblHeader/>
-          <w:jc w:val="center"/>
-        </w:trPr>
-        <w:tc>
-          <w:tcPr>
-            <w:tcW w:w="36pt" w:type="dxa"/>
-            <w:vMerge/>
-          </w:tcPr>
-          <w:p>
-            <w:pPr>
-              <w:rPr>
-                <w:sz w:val="16"/>
-                <w:szCs w:val="16"/>
-              </w:rPr>
-            </w:pPr>
-          </w:p>
-        </w:tc>
-        <w:tc>
-          <w:tcPr>
-            <w:tcW w:w="117pt" w:type="dxa"/>
-            <w:vAlign w:val="center"/>
-          </w:tcPr>
-          <w:p>
-            <w:pPr>
-              <w:pStyle w:val="tablecolsubhead"/>
-            </w:pPr>
-            <w:r>
-              <w:t>Table column subhead</w:t>
-            </w:r>
-          </w:p>
-        </w:tc>
-        <w:tc>
-          <w:tcPr>
-            <w:tcW w:w="45pt" w:type="dxa"/>
-            <w:vAlign w:val="center"/>
-          </w:tcPr>
-          <w:p>
-            <w:pPr>
-              <w:pStyle w:val="tablecolsubhead"/>
-            </w:pPr>
-            <w:r>
-              <w:t>Subhead</w:t>
-            </w:r>
-          </w:p>
-        </w:tc>
-        <w:tc>
-          <w:tcPr>
-            <w:tcW w:w="45pt" w:type="dxa"/>
-            <w:vAlign w:val="center"/>
-          </w:tcPr>
-          <w:p>
-            <w:pPr>
-              <w:pStyle w:val="tablecolsubhead"/>
-            </w:pPr>
-            <w:r>
-              <w:t>Subhead</w:t>
-            </w:r>
-          </w:p>
-        </w:tc>
-      </w:tr>
-      <w:tr>
-        <w:trPr>
-          <w:trHeight w:val="320"/>
-          <w:jc w:val="center"/>
-        </w:trPr>
-        <w:tc>
-          <w:tcPr>
-            <w:tcW w:w="36pt" w:type="dxa"/>
-            <w:vAlign w:val="center"/>
-          </w:tcPr>
-          <w:p>
-            <w:pPr>
-              <w:pStyle w:val="tablecopy"/>
-              <w:rPr>
-                <w:sz w:val="8"/>
-                <w:szCs w:val="8"/>
-              </w:rPr>
-            </w:pPr>
-            <w:r>
-              <w:t>copy</w:t>
-            </w:r>
-          </w:p>
-        </w:tc>
-        <w:tc>
-          <w:tcPr>
-            <w:tcW w:w="117pt" w:type="dxa"/>
-            <w:vAlign w:val="center"/>
-          </w:tcPr>
-          <w:p>
-            <w:pPr>
-              <w:pStyle w:val="tablecopy"/>
-            </w:pPr>
-            <w:r>
-              <w:t>More table copy</w:t>
-            </w:r>
-            <w:r>
-              <w:rPr>
-                <w:vertAlign w:val="superscript"/>
-              </w:rPr>
-              <w:t>a</w:t>
-            </w:r>
-          </w:p>
-        </w:tc>
-        <w:tc>
-          <w:tcPr>
-            <w:tcW w:w="45pt" w:type="dxa"/>
-            <w:vAlign w:val="center"/>
-          </w:tcPr>
-          <w:p>
-            <w:pPr>
-              <w:rPr>
-                <w:sz w:val="16"/>
-                <w:szCs w:val="16"/>
-              </w:rPr>
-            </w:pPr>
-          </w:p>
-        </w:tc>
-        <w:tc>
-          <w:tcPr>
-            <w:tcW w:w="45pt" w:type="dxa"/>
-            <w:vAlign w:val="center"/>
-          </w:tcPr>
-          <w:p>
-            <w:pPr>
-              <w:rPr>
-                <w:sz w:val="16"/>
-                <w:szCs w:val="16"/>
-              </w:rPr>
-            </w:pPr>
-          </w:p>
-        </w:tc>
-      </w:tr>
-    </w:tbl>
-    <w:p>
-      <w:pPr>
-        <w:pStyle w:val="tablefootnote"/>
-      </w:pPr>
-      <w:r>
-        <w:t xml:space="preserve">Sample </w:t>
-      </w:r>
-      <w:r>
-        <w:t>of</w:t>
-      </w:r>
-      <w:r>
-        <w:t xml:space="preserve"> a </w:t>
-      </w:r>
-      <w:r>
-        <w:t>Table</w:t>
-      </w:r>
-      <w:r>
-        <w:t xml:space="preserve"> </w:t>
-      </w:r>
-      <w:r>
-        <w:t>footnote</w:t>
-      </w:r>
-      <w:r>
-        <w:t xml:space="preserve">. </w:t>
-      </w:r>
-      <w:r>
-        <w:t>(</w:t>
-      </w:r>
-      <w:r>
-        <w:rPr>
-          <w:i/>
-        </w:rPr>
-        <w:t>Table footnote</w:t>
-      </w:r>
-      <w:r>
-        <w:t>)</w:t>
-      </w:r>
-    </w:p>
-    <w:p>
-      <w:pPr>
-        <w:pStyle w:val="figurecaption"/>
-      </w:pPr>
-      <w:r>
-        <w:t xml:space="preserve">Example of a figure </w:t>
-      </w:r>
-      <w:r>
-        <w:t>caption</w:t>
-      </w:r>
-      <w:r>
-        <w:t xml:space="preserve">. </w:t>
-      </w:r>
-      <w:r>
-        <w:rPr>
-          <w:iCs/>
-        </w:rPr>
-        <w:t>(</w:t>
-      </w:r>
-      <w:r>
-        <w:rPr>
-          <w:i/>
-          <w:iCs/>
-        </w:rPr>
-        <w:t>figure caption</w:t>
-      </w:r>
-      <w:r>
-        <w:rPr>
-          <w:iCs/>
-        </w:rPr>
-        <w:t>)</w:t>
-      </w:r>
-    </w:p>
-    <w:p>
-      <w:pPr>
-        <w:pStyle w:val="BodyText"/>
-      </w:pPr>
-      <w:r>
-        <w:t>Figure Labels: Use 8 point Times New Roman for Figure labels. Use words rather than symbols or abbreviations when writing Figure axis labels to avoid confusing the reader. As an example, write the quantity “Magnetization”, or “Magnetization, M”, not just “M”. If including units in the label, present them within parentheses. Do not label axes only with units. In the example, write “Magnetization (A/m)” or “Magnetization {A[m(1)]}”, not just “A/m”. Do not label axes</w:t>
-      </w:r>
-      <w:r>
-        <w:t xml:space="preserve"> </w:t>
-      </w:r>
-      <w:r>
-        <w:t>with a ratio of quantities and units. For example, write “Temperature (K)”, not “Temperature/K”.</w:t>
-      </w:r>
     </w:p>
     <w:p>
       <w:pPr>
@@ -7933,7 +7048,6 @@
       <w:r>
         <w:t>”. Avoid the stilted expression “</w:t>
       </w:r>
-      <w:proofErr w:type="spellStart"/>
       <w:r>
         <w:rPr>
           <w:lang w:val="en-US"/>
@@ -7941,11 +7055,7 @@
         <w:t>o</w:t>
       </w:r>
       <w:r>
-        <w:t>ne</w:t>
-      </w:r>
-      <w:proofErr w:type="spellEnd"/>
-      <w:r>
-        <w:t xml:space="preserve"> of us (R. B. G.) thanks </w:t>
+        <w:t xml:space="preserve">ne of us (R. B. G.) thanks </w:t>
       </w:r>
       <w:r>
         <w:t>...</w:t>
@@ -7986,6 +7096,7 @@
         <w:pStyle w:val="Heading5"/>
       </w:pPr>
       <w:r>
+        <w:lastRenderedPageBreak/>
         <w:t>References</w:t>
       </w:r>
     </w:p>
@@ -8334,6 +7445,7 @@
         <w:ind w:start="17.70pt"/>
       </w:pPr>
       <w:r>
+        <w:lastRenderedPageBreak/>
         <w:t>Guo, Changlu, Anders Nymark Christensen, and Morten Rieger Hannemose. “Med-Art: Diffusion Transformer for 2D Medical Text-to-Image Generation.” arXiv:2506.20449. Preprint, arXiv, June 25, 2025. https://doi.org/10.48550/arXiv.2506.20449.</w:t>
       </w:r>
     </w:p>
@@ -8518,6 +7630,35 @@
           <w:lang w:val="fr-CA"/>
         </w:rPr>
         <w:t>Preprint, arXiv, April 3, 2015. https://doi.org/10.48550/arXiv.1504.00325.</w:t>
+      </w:r>
+    </w:p>
+    <w:p>
+      <w:pPr>
+        <w:pStyle w:val="references"/>
+      </w:pPr>
+      <w:r>
+        <w:t xml:space="preserve">Pogorelov, Konstantin, Kristin Ranheim Randel, Carsten Griwodz, et al. “KVASIR: A Multi-Class Image Dataset for Computer Aided Gastrointestinal Disease Detection.” </w:t>
+      </w:r>
+      <w:r>
+        <w:rPr>
+          <w:i/>
+          <w:iCs/>
+        </w:rPr>
+        <w:t>Proceedings of the 8th ACM on Multimedia Systems Conference</w:t>
+      </w:r>
+      <w:r>
+        <w:t xml:space="preserve">, ACM, June 20, 2017, 164–69. </w:t>
+      </w:r>
+      <w:hyperlink r:id="rId10" w:history="1">
+        <w:r>
+          <w:rPr>
+            <w:rStyle w:val="Hyperlink"/>
+          </w:rPr>
+          <w:t>https://doi.org/10.1145/3083187.3083212</w:t>
+        </w:r>
+      </w:hyperlink>
+      <w:r>
+        <w:t>.</w:t>
       </w:r>
     </w:p>
     <w:p>
@@ -10246,6 +9387,9 @@
   </w:num>
   <w:num w:numId="31" w16cid:durableId="582958787">
     <w:abstractNumId w:val="18"/>
+  </w:num>
+  <w:num w:numId="32" w16cid:durableId="1356082842">
+    <w:abstractNumId w:val="16"/>
   </w:num>
 </w:numbering>
 </file>

</xml_diff>